<commit_message>
wip: atualizações adicionais dos módulos T2–T7
Co-Authored-By: Claude <noreply@anthropic.com>
</commit_message>
<xml_diff>
--- a/server/templates/individual.docx
+++ b/server/templates/individual.docx
@@ -180,6 +180,24 @@
     </w:p>
     <w:p>
       <w:pPr>
+        <w:spacing w:before="0" w:after="0" w:line="240" w:lineRule="auto"/>
+        <w:rPr>
+          <w:rFonts w:ascii="Arial" w:hAnsi="Arial" w:cs="Arial"/>
+          <w:sz w:val="24"/>
+          <w:szCs w:val="24"/>
+        </w:rPr>
+      </w:pPr>
+      <w:r>
+        <w:rPr>
+          <w:rFonts w:ascii="Arial" w:hAnsi="Arial" w:cs="Arial"/>
+          <w:sz w:val="24"/>
+          <w:szCs w:val="24"/>
+        </w:rPr>
+        <w:t xml:space="preserve">{#introducao}</w:t>
+      </w:r>
+    </w:p>
+    <w:p>
+      <w:pPr>
         <w:spacing w:before="0" w:after="120" w:line="360" w:lineRule="auto"/>
         <w:jc w:val="both"/>
         <w:rPr>
@@ -194,7 +212,25 @@
           <w:sz w:val="24"/>
           <w:szCs w:val="24"/>
         </w:rPr>
-        <w:t xml:space="preserve">{#introducao}{.}{/introducao}</w:t>
+        <w:t xml:space="preserve">{.}</w:t>
+      </w:r>
+    </w:p>
+    <w:p>
+      <w:pPr>
+        <w:spacing w:before="0" w:after="0" w:line="240" w:lineRule="auto"/>
+        <w:rPr>
+          <w:rFonts w:ascii="Arial" w:hAnsi="Arial" w:cs="Arial"/>
+          <w:sz w:val="24"/>
+          <w:szCs w:val="24"/>
+        </w:rPr>
+      </w:pPr>
+      <w:r>
+        <w:rPr>
+          <w:rFonts w:ascii="Arial" w:hAnsi="Arial" w:cs="Arial"/>
+          <w:sz w:val="24"/>
+          <w:szCs w:val="24"/>
+        </w:rPr>
+        <w:t xml:space="preserve">{/introducao}</w:t>
       </w:r>
     </w:p>
     <w:p>
@@ -222,6 +258,24 @@
     </w:p>
     <w:p>
       <w:pPr>
+        <w:spacing w:before="0" w:after="0" w:line="240" w:lineRule="auto"/>
+        <w:rPr>
+          <w:rFonts w:ascii="Arial" w:hAnsi="Arial" w:cs="Arial"/>
+          <w:sz w:val="24"/>
+          <w:szCs w:val="24"/>
+        </w:rPr>
+      </w:pPr>
+      <w:r>
+        <w:rPr>
+          <w:rFonts w:ascii="Arial" w:hAnsi="Arial" w:cs="Arial"/>
+          <w:sz w:val="24"/>
+          <w:szCs w:val="24"/>
+        </w:rPr>
+        <w:t xml:space="preserve">{#objetivo}</w:t>
+      </w:r>
+    </w:p>
+    <w:p>
+      <w:pPr>
         <w:spacing w:before="0" w:after="120" w:line="360" w:lineRule="auto"/>
         <w:jc w:val="both"/>
         <w:rPr>
@@ -236,7 +290,25 @@
           <w:sz w:val="24"/>
           <w:szCs w:val="24"/>
         </w:rPr>
-        <w:t xml:space="preserve">{#objetivo}{.}{/objetivo}</w:t>
+        <w:t xml:space="preserve">{.}</w:t>
+      </w:r>
+    </w:p>
+    <w:p>
+      <w:pPr>
+        <w:spacing w:before="0" w:after="0" w:line="240" w:lineRule="auto"/>
+        <w:rPr>
+          <w:rFonts w:ascii="Arial" w:hAnsi="Arial" w:cs="Arial"/>
+          <w:sz w:val="24"/>
+          <w:szCs w:val="24"/>
+        </w:rPr>
+      </w:pPr>
+      <w:r>
+        <w:rPr>
+          <w:rFonts w:ascii="Arial" w:hAnsi="Arial" w:cs="Arial"/>
+          <w:sz w:val="24"/>
+          <w:szCs w:val="24"/>
+        </w:rPr>
+        <w:t xml:space="preserve">{/objetivo}</w:t>
       </w:r>
     </w:p>
     <w:p>
@@ -264,6 +336,24 @@
     </w:p>
     <w:p>
       <w:pPr>
+        <w:spacing w:before="0" w:after="0" w:line="240" w:lineRule="auto"/>
+        <w:rPr>
+          <w:rFonts w:ascii="Arial" w:hAnsi="Arial" w:cs="Arial"/>
+          <w:sz w:val="24"/>
+          <w:szCs w:val="24"/>
+        </w:rPr>
+      </w:pPr>
+      <w:r>
+        <w:rPr>
+          <w:rFonts w:ascii="Arial" w:hAnsi="Arial" w:cs="Arial"/>
+          <w:sz w:val="24"/>
+          <w:szCs w:val="24"/>
+        </w:rPr>
+        <w:t xml:space="preserve">{#metodologia}</w:t>
+      </w:r>
+    </w:p>
+    <w:p>
+      <w:pPr>
         <w:spacing w:before="0" w:after="120" w:line="360" w:lineRule="auto"/>
         <w:jc w:val="both"/>
         <w:rPr>
@@ -278,7 +368,25 @@
           <w:sz w:val="24"/>
           <w:szCs w:val="24"/>
         </w:rPr>
-        <w:t xml:space="preserve">{#metodologia}{.}{/metodologia}</w:t>
+        <w:t xml:space="preserve">{.}</w:t>
+      </w:r>
+    </w:p>
+    <w:p>
+      <w:pPr>
+        <w:spacing w:before="0" w:after="0" w:line="240" w:lineRule="auto"/>
+        <w:rPr>
+          <w:rFonts w:ascii="Arial" w:hAnsi="Arial" w:cs="Arial"/>
+          <w:sz w:val="24"/>
+          <w:szCs w:val="24"/>
+        </w:rPr>
+      </w:pPr>
+      <w:r>
+        <w:rPr>
+          <w:rFonts w:ascii="Arial" w:hAnsi="Arial" w:cs="Arial"/>
+          <w:sz w:val="24"/>
+          <w:szCs w:val="24"/>
+        </w:rPr>
+        <w:t xml:space="preserve">{/metodologia}</w:t>
       </w:r>
     </w:p>
     <w:p>
@@ -329,6 +437,24 @@
     </w:p>
     <w:p>
       <w:pPr>
+        <w:spacing w:before="0" w:after="0" w:line="240" w:lineRule="auto"/>
+        <w:rPr>
+          <w:rFonts w:ascii="Arial" w:hAnsi="Arial" w:cs="Arial"/>
+          <w:sz w:val="24"/>
+          <w:szCs w:val="24"/>
+        </w:rPr>
+      </w:pPr>
+      <w:r>
+        <w:rPr>
+          <w:rFonts w:ascii="Arial" w:hAnsi="Arial" w:cs="Arial"/>
+          <w:sz w:val="24"/>
+          <w:szCs w:val="24"/>
+        </w:rPr>
+        <w:t xml:space="preserve">{#diagnostico}</w:t>
+      </w:r>
+    </w:p>
+    <w:p>
+      <w:pPr>
         <w:spacing w:before="0" w:after="120" w:line="360" w:lineRule="auto"/>
         <w:jc w:val="both"/>
         <w:rPr>
@@ -343,7 +469,25 @@
           <w:sz w:val="24"/>
           <w:szCs w:val="24"/>
         </w:rPr>
-        <w:t xml:space="preserve">{#diagnostico}{.}{/diagnostico}</w:t>
+        <w:t xml:space="preserve">{.}</w:t>
+      </w:r>
+    </w:p>
+    <w:p>
+      <w:pPr>
+        <w:spacing w:before="0" w:after="0" w:line="240" w:lineRule="auto"/>
+        <w:rPr>
+          <w:rFonts w:ascii="Arial" w:hAnsi="Arial" w:cs="Arial"/>
+          <w:sz w:val="24"/>
+          <w:szCs w:val="24"/>
+        </w:rPr>
+      </w:pPr>
+      <w:r>
+        <w:rPr>
+          <w:rFonts w:ascii="Arial" w:hAnsi="Arial" w:cs="Arial"/>
+          <w:sz w:val="24"/>
+          <w:szCs w:val="24"/>
+        </w:rPr>
+        <w:t xml:space="preserve">{/diagnostico}</w:t>
       </w:r>
     </w:p>
     <w:p>
@@ -394,6 +538,24 @@
     </w:p>
     <w:p>
       <w:pPr>
+        <w:spacing w:before="0" w:after="0" w:line="240" w:lineRule="auto"/>
+        <w:rPr>
+          <w:rFonts w:ascii="Arial" w:hAnsi="Arial" w:cs="Arial"/>
+          <w:sz w:val="24"/>
+          <w:szCs w:val="24"/>
+        </w:rPr>
+      </w:pPr>
+      <w:r>
+        <w:rPr>
+          <w:rFonts w:ascii="Arial" w:hAnsi="Arial" w:cs="Arial"/>
+          <w:sz w:val="24"/>
+          <w:szCs w:val="24"/>
+        </w:rPr>
+        <w:t xml:space="preserve">{#impactoAlimentar}</w:t>
+      </w:r>
+    </w:p>
+    <w:p>
+      <w:pPr>
         <w:spacing w:before="0" w:after="120" w:line="360" w:lineRule="auto"/>
         <w:jc w:val="both"/>
         <w:rPr>
@@ -408,7 +570,25 @@
           <w:sz w:val="24"/>
           <w:szCs w:val="24"/>
         </w:rPr>
-        <w:t xml:space="preserve">{#impactoAlimentar}{.}{/impactoAlimentar}</w:t>
+        <w:t xml:space="preserve">{.}</w:t>
+      </w:r>
+    </w:p>
+    <w:p>
+      <w:pPr>
+        <w:spacing w:before="0" w:after="0" w:line="240" w:lineRule="auto"/>
+        <w:rPr>
+          <w:rFonts w:ascii="Arial" w:hAnsi="Arial" w:cs="Arial"/>
+          <w:sz w:val="24"/>
+          <w:szCs w:val="24"/>
+        </w:rPr>
+      </w:pPr>
+      <w:r>
+        <w:rPr>
+          <w:rFonts w:ascii="Arial" w:hAnsi="Arial" w:cs="Arial"/>
+          <w:sz w:val="24"/>
+          <w:szCs w:val="24"/>
+        </w:rPr>
+        <w:t xml:space="preserve">{/impactoAlimentar}</w:t>
       </w:r>
     </w:p>
     <w:p>
@@ -436,6 +616,24 @@
     </w:p>
     <w:p>
       <w:pPr>
+        <w:spacing w:before="0" w:after="0" w:line="240" w:lineRule="auto"/>
+        <w:rPr>
+          <w:rFonts w:ascii="Arial" w:hAnsi="Arial" w:cs="Arial"/>
+          <w:sz w:val="24"/>
+          <w:szCs w:val="24"/>
+        </w:rPr>
+      </w:pPr>
+      <w:r>
+        <w:rPr>
+          <w:rFonts w:ascii="Arial" w:hAnsi="Arial" w:cs="Arial"/>
+          <w:sz w:val="24"/>
+          <w:szCs w:val="24"/>
+        </w:rPr>
+        <w:t xml:space="preserve">{#impactoDesafios}</w:t>
+      </w:r>
+    </w:p>
+    <w:p>
+      <w:pPr>
         <w:spacing w:before="0" w:after="120" w:line="360" w:lineRule="auto"/>
         <w:jc w:val="both"/>
         <w:rPr>
@@ -450,7 +648,25 @@
           <w:sz w:val="24"/>
           <w:szCs w:val="24"/>
         </w:rPr>
-        <w:t xml:space="preserve">{#impactoDesafios}{.}{/impactoDesafios}</w:t>
+        <w:t xml:space="preserve">{.}</w:t>
+      </w:r>
+    </w:p>
+    <w:p>
+      <w:pPr>
+        <w:spacing w:before="0" w:after="0" w:line="240" w:lineRule="auto"/>
+        <w:rPr>
+          <w:rFonts w:ascii="Arial" w:hAnsi="Arial" w:cs="Arial"/>
+          <w:sz w:val="24"/>
+          <w:szCs w:val="24"/>
+        </w:rPr>
+      </w:pPr>
+      <w:r>
+        <w:rPr>
+          <w:rFonts w:ascii="Arial" w:hAnsi="Arial" w:cs="Arial"/>
+          <w:sz w:val="24"/>
+          <w:szCs w:val="24"/>
+        </w:rPr>
+        <w:t xml:space="preserve">{/impactoDesafios}</w:t>
       </w:r>
     </w:p>
     <w:p>
@@ -478,6 +694,24 @@
     </w:p>
     <w:p>
       <w:pPr>
+        <w:spacing w:before="0" w:after="0" w:line="240" w:lineRule="auto"/>
+        <w:rPr>
+          <w:rFonts w:ascii="Arial" w:hAnsi="Arial" w:cs="Arial"/>
+          <w:sz w:val="24"/>
+          <w:szCs w:val="24"/>
+        </w:rPr>
+      </w:pPr>
+      <w:r>
+        <w:rPr>
+          <w:rFonts w:ascii="Arial" w:hAnsi="Arial" w:cs="Arial"/>
+          <w:sz w:val="24"/>
+          <w:szCs w:val="24"/>
+        </w:rPr>
+        <w:t xml:space="preserve">{#impactoEconomico}</w:t>
+      </w:r>
+    </w:p>
+    <w:p>
+      <w:pPr>
         <w:spacing w:before="0" w:after="120" w:line="360" w:lineRule="auto"/>
         <w:jc w:val="both"/>
         <w:rPr>
@@ -492,7 +726,25 @@
           <w:sz w:val="24"/>
           <w:szCs w:val="24"/>
         </w:rPr>
-        <w:t xml:space="preserve">{#impactoEconomico}{.}{/impactoEconomico}</w:t>
+        <w:t xml:space="preserve">{.}</w:t>
+      </w:r>
+    </w:p>
+    <w:p>
+      <w:pPr>
+        <w:spacing w:before="0" w:after="0" w:line="240" w:lineRule="auto"/>
+        <w:rPr>
+          <w:rFonts w:ascii="Arial" w:hAnsi="Arial" w:cs="Arial"/>
+          <w:sz w:val="24"/>
+          <w:szCs w:val="24"/>
+        </w:rPr>
+      </w:pPr>
+      <w:r>
+        <w:rPr>
+          <w:rFonts w:ascii="Arial" w:hAnsi="Arial" w:cs="Arial"/>
+          <w:sz w:val="24"/>
+          <w:szCs w:val="24"/>
+        </w:rPr>
+        <w:t xml:space="preserve">{/impactoEconomico}</w:t>
       </w:r>
     </w:p>
     <w:p>
@@ -520,6 +772,24 @@
     </w:p>
     <w:p>
       <w:pPr>
+        <w:spacing w:before="0" w:after="0" w:line="240" w:lineRule="auto"/>
+        <w:rPr>
+          <w:rFonts w:ascii="Arial" w:hAnsi="Arial" w:cs="Arial"/>
+          <w:sz w:val="24"/>
+          <w:szCs w:val="24"/>
+        </w:rPr>
+      </w:pPr>
+      <w:r>
+        <w:rPr>
+          <w:rFonts w:ascii="Arial" w:hAnsi="Arial" w:cs="Arial"/>
+          <w:sz w:val="24"/>
+          <w:szCs w:val="24"/>
+        </w:rPr>
+        <w:t xml:space="preserve">{#feedback}</w:t>
+      </w:r>
+    </w:p>
+    <w:p>
+      <w:pPr>
         <w:spacing w:before="0" w:after="120" w:line="360" w:lineRule="auto"/>
         <w:jc w:val="both"/>
         <w:rPr>
@@ -534,7 +804,25 @@
           <w:sz w:val="24"/>
           <w:szCs w:val="24"/>
         </w:rPr>
-        <w:t xml:space="preserve">{#feedback}{.}{/feedback}</w:t>
+        <w:t xml:space="preserve">{.}</w:t>
+      </w:r>
+    </w:p>
+    <w:p>
+      <w:pPr>
+        <w:spacing w:before="0" w:after="0" w:line="240" w:lineRule="auto"/>
+        <w:rPr>
+          <w:rFonts w:ascii="Arial" w:hAnsi="Arial" w:cs="Arial"/>
+          <w:sz w:val="24"/>
+          <w:szCs w:val="24"/>
+        </w:rPr>
+      </w:pPr>
+      <w:r>
+        <w:rPr>
+          <w:rFonts w:ascii="Arial" w:hAnsi="Arial" w:cs="Arial"/>
+          <w:sz w:val="24"/>
+          <w:szCs w:val="24"/>
+        </w:rPr>
+        <w:t xml:space="preserve">{/feedback}</w:t>
       </w:r>
     </w:p>
     <w:p>
@@ -562,6 +850,24 @@
     </w:p>
     <w:p>
       <w:pPr>
+        <w:spacing w:before="0" w:after="0" w:line="240" w:lineRule="auto"/>
+        <w:rPr>
+          <w:rFonts w:ascii="Arial" w:hAnsi="Arial" w:cs="Arial"/>
+          <w:sz w:val="24"/>
+          <w:szCs w:val="24"/>
+        </w:rPr>
+      </w:pPr>
+      <w:r>
+        <w:rPr>
+          <w:rFonts w:ascii="Arial" w:hAnsi="Arial" w:cs="Arial"/>
+          <w:sz w:val="24"/>
+          <w:szCs w:val="24"/>
+        </w:rPr>
+        <w:t xml:space="preserve">{#consideracoes}</w:t>
+      </w:r>
+    </w:p>
+    <w:p>
+      <w:pPr>
         <w:spacing w:before="0" w:after="120" w:line="360" w:lineRule="auto"/>
         <w:jc w:val="both"/>
         <w:rPr>
@@ -576,7 +882,25 @@
           <w:sz w:val="24"/>
           <w:szCs w:val="24"/>
         </w:rPr>
-        <w:t xml:space="preserve">{#consideracoes}{.}{/consideracoes}</w:t>
+        <w:t xml:space="preserve">{.}</w:t>
+      </w:r>
+    </w:p>
+    <w:p>
+      <w:pPr>
+        <w:spacing w:before="0" w:after="0" w:line="240" w:lineRule="auto"/>
+        <w:rPr>
+          <w:rFonts w:ascii="Arial" w:hAnsi="Arial" w:cs="Arial"/>
+          <w:sz w:val="24"/>
+          <w:szCs w:val="24"/>
+        </w:rPr>
+      </w:pPr>
+      <w:r>
+        <w:rPr>
+          <w:rFonts w:ascii="Arial" w:hAnsi="Arial" w:cs="Arial"/>
+          <w:sz w:val="24"/>
+          <w:szCs w:val="24"/>
+        </w:rPr>
+        <w:t xml:space="preserve">{/consideracoes}</w:t>
       </w:r>
     </w:p>
     <w:p>

</xml_diff>

<commit_message>
feat(familias): plano de metas (F4) e índice de progresso com reavaliação (F5)
F4 (migração 082): metas por dimensão com prazo e situação, avanço registrado nos contatos,
alerta de família sem meta (30 dias, editável), metas na linha do tempo e no Início.

F5 (migração 083): índice 0–100 por dimensão (alimentação, renda per capita por faixa de SM,
economia, autonomia) com semáforo de tolerância 5, instantâneo versionado, reavaliação rápida
na metade do prazo, aba Indicadores com gráfico e seção 'Evolução' no relatório individual.

Service worker associal-v17.

Co-Authored-By: Claude Opus 5.5 <noreply@anthropic.com>
</commit_message>
<xml_diff>
--- a/server/templates/individual.docx
+++ b/server/templates/individual.docx
@@ -745,6 +745,148 @@
           <w:szCs w:val="24"/>
         </w:rPr>
         <w:t xml:space="preserve">{/impactoEconomico}</w:t>
+      </w:r>
+    </w:p>
+    <w:p>
+      <w:pPr>
+        <w:spacing w:before="0" w:after="0" w:line="240" w:lineRule="auto"/>
+        <w:rPr>
+          <w:rFonts w:ascii="Arial" w:hAnsi="Arial" w:cs="Arial"/>
+          <w:sz w:val="24"/>
+          <w:szCs w:val="24"/>
+        </w:rPr>
+      </w:pPr>
+      <w:r>
+        <w:rPr>
+          <w:rFonts w:ascii="Arial" w:hAnsi="Arial" w:cs="Arial"/>
+          <w:sz w:val="24"/>
+          <w:szCs w:val="24"/>
+        </w:rPr>
+        <w:t xml:space="preserve">{#temEvolucao}</w:t>
+      </w:r>
+    </w:p>
+    <w:p>
+      <w:pPr>
+        <w:keepNext/>
+        <w:spacing w:before="120" w:after="60" w:line="240" w:lineRule="auto"/>
+        <w:rPr>
+          <w:rFonts w:ascii="Arial" w:hAnsi="Arial" w:cs="Arial"/>
+          <w:b/>
+          <w:bCs/>
+          <w:sz w:val="24"/>
+          <w:szCs w:val="24"/>
+        </w:rPr>
+      </w:pPr>
+      <w:r>
+        <w:rPr>
+          <w:rFonts w:ascii="Arial" w:hAnsi="Arial" w:cs="Arial"/>
+          <w:b/>
+          <w:bCs/>
+          <w:sz w:val="24"/>
+          <w:szCs w:val="24"/>
+        </w:rPr>
+        <w:t xml:space="preserve">Evolução durante o acompanhamento:</w:t>
+      </w:r>
+    </w:p>
+    <w:p>
+      <w:pPr>
+        <w:spacing w:before="0" w:after="0" w:line="240" w:lineRule="auto"/>
+        <w:rPr>
+          <w:rFonts w:ascii="Arial" w:hAnsi="Arial" w:cs="Arial"/>
+          <w:sz w:val="24"/>
+          <w:szCs w:val="24"/>
+        </w:rPr>
+      </w:pPr>
+      <w:r>
+        <w:rPr>
+          <w:rFonts w:ascii="Arial" w:hAnsi="Arial" w:cs="Arial"/>
+          <w:sz w:val="24"/>
+          <w:szCs w:val="24"/>
+        </w:rPr>
+        <w:t xml:space="preserve">{#evolucao}</w:t>
+      </w:r>
+    </w:p>
+    <w:p>
+      <w:pPr>
+        <w:spacing w:before="0" w:after="120" w:line="360" w:lineRule="auto"/>
+        <w:jc w:val="both"/>
+        <w:rPr>
+          <w:rFonts w:ascii="Arial" w:hAnsi="Arial" w:cs="Arial"/>
+          <w:sz w:val="24"/>
+          <w:szCs w:val="24"/>
+        </w:rPr>
+      </w:pPr>
+      <w:r>
+        <w:rPr>
+          <w:rFonts w:ascii="Arial" w:hAnsi="Arial" w:cs="Arial"/>
+          <w:sz w:val="24"/>
+          <w:szCs w:val="24"/>
+        </w:rPr>
+        <w:t xml:space="preserve">{.}</w:t>
+      </w:r>
+    </w:p>
+    <w:p>
+      <w:pPr>
+        <w:spacing w:before="0" w:after="0" w:line="240" w:lineRule="auto"/>
+        <w:rPr>
+          <w:rFonts w:ascii="Arial" w:hAnsi="Arial" w:cs="Arial"/>
+          <w:sz w:val="24"/>
+          <w:szCs w:val="24"/>
+        </w:rPr>
+      </w:pPr>
+      <w:r>
+        <w:rPr>
+          <w:rFonts w:ascii="Arial" w:hAnsi="Arial" w:cs="Arial"/>
+          <w:sz w:val="24"/>
+          <w:szCs w:val="24"/>
+        </w:rPr>
+        <w:t xml:space="preserve">{/evolucao}</w:t>
+      </w:r>
+    </w:p>
+    <w:p>
+      <w:pPr>
+        <w:spacing w:before="0" w:after="0" w:line="240" w:lineRule="auto"/>
+        <w:rPr>
+          <w:rFonts w:ascii="Arial" w:hAnsi="Arial" w:cs="Arial"/>
+          <w:sz w:val="24"/>
+          <w:szCs w:val="24"/>
+        </w:rPr>
+      </w:pPr>
+      <w:r>
+        <w:rPr>
+          <w:rFonts w:ascii="Arial" w:hAnsi="Arial" w:cs="Arial"/>
+          <w:sz w:val="24"/>
+          <w:szCs w:val="24"/>
+        </w:rPr>
+        <w:t xml:space="preserve">{@evolucaoTabela}</w:t>
+      </w:r>
+    </w:p>
+    <w:p>
+      <w:pPr>
+        <w:spacing w:before="0" w:after="120" w:line="240" w:lineRule="auto"/>
+        <w:rPr>
+          <w:rFonts w:ascii="Arial" w:hAnsi="Arial" w:cs="Arial"/>
+          <w:sz w:val="24"/>
+          <w:szCs w:val="24"/>
+        </w:rPr>
+      </w:pPr>
+    </w:p>
+    <w:p>
+      <w:pPr>
+        <w:spacing w:before="0" w:after="0" w:line="240" w:lineRule="auto"/>
+        <w:rPr>
+          <w:rFonts w:ascii="Arial" w:hAnsi="Arial" w:cs="Arial"/>
+          <w:sz w:val="24"/>
+          <w:szCs w:val="24"/>
+        </w:rPr>
+      </w:pPr>
+      <w:r>
+        <w:rPr>
+          <w:rFonts w:ascii="Arial" w:hAnsi="Arial" w:cs="Arial"/>
+          <w:sz w:val="24"/>
+          <w:szCs w:val="24"/>
+        </w:rPr>
+        <w:t xml:space="preserve">{/temEvolucao}</w:t>
       </w:r>
     </w:p>
     <w:p>

</xml_diff>

<commit_message>
feat(familias): modelos oficiais de questionário inicial/final, registro periódico e relatório final (M1)
Questionário inicial (modelo 1) e final (modelo 3) com perguntas diferentes,
no catálogo (migração 086, só Docker de teste); comparação por pares
equivalentes e índice de progresso versão 2; questionários antigos ficam como
'Formato anterior' (só leitura). Registro periódico no formato do modelo 2
(migração 087). Relatório final familiar (modelo 4) substitui o individual;
.docx dos questionários preenchidos e do registro periódico. Decisões do
usuário: final 3.2 com faixa R$ 301–400; inicial 3.6 só Sim/Parcialmente/Não.
sw associal-v24.

Co-Authored-By: Claude Opus 5.5 <noreply@anthropic.com>
</commit_message>
<xml_diff>
--- a/server/templates/individual.docx
+++ b/server/templates/individual.docx
@@ -4,87 +4,39 @@
   <w:body>
     <w:p>
       <w:pPr>
-        <w:spacing w:before="0" w:after="0" w:line="240" w:lineRule="auto"/>
-        <w:rPr>
-          <w:rFonts w:ascii="Arial" w:hAnsi="Arial" w:cs="Arial"/>
-          <w:sz w:val="24"/>
-          <w:szCs w:val="24"/>
-        </w:rPr>
-      </w:pPr>
-    </w:p>
-    <w:p>
-      <w:pPr>
-        <w:spacing w:before="0" w:after="0" w:line="240" w:lineRule="auto"/>
-        <w:rPr>
-          <w:rFonts w:ascii="Arial" w:hAnsi="Arial" w:cs="Arial"/>
-          <w:sz w:val="24"/>
-          <w:szCs w:val="24"/>
-        </w:rPr>
-      </w:pPr>
-    </w:p>
-    <w:p>
-      <w:pPr>
-        <w:spacing w:before="0" w:after="0" w:line="240" w:lineRule="auto"/>
+        <w:spacing w:before="0" w:after="200" w:line="276" w:lineRule="auto"/>
         <w:jc w:val="center"/>
         <w:rPr>
-          <w:rFonts w:ascii="Arial" w:hAnsi="Arial" w:cs="Arial"/>
-          <w:b/>
-          <w:bCs/>
-          <w:sz w:val="24"/>
-          <w:szCs w:val="24"/>
-        </w:rPr>
-      </w:pPr>
-      <w:r>
-        <w:rPr>
-          <w:rFonts w:ascii="Arial" w:hAnsi="Arial" w:cs="Arial"/>
-          <w:b/>
-          <w:bCs/>
-          <w:sz w:val="24"/>
-          <w:szCs w:val="24"/>
-        </w:rPr>
-        <w:t xml:space="preserve">RELATÓRIO INDIVIDUAL FAMILIAR</w:t>
-      </w:r>
-    </w:p>
-    <w:p>
-      <w:pPr>
-        <w:spacing w:before="0" w:after="0" w:line="240" w:lineRule="auto"/>
-        <w:rPr>
-          <w:rFonts w:ascii="Arial" w:hAnsi="Arial" w:cs="Arial"/>
-          <w:sz w:val="24"/>
-          <w:szCs w:val="24"/>
-        </w:rPr>
-      </w:pPr>
-    </w:p>
-    <w:p>
-      <w:pPr>
-        <w:spacing w:before="0" w:after="0" w:line="240" w:lineRule="auto"/>
-        <w:rPr>
-          <w:rFonts w:ascii="Arial" w:hAnsi="Arial" w:cs="Arial"/>
-          <w:sz w:val="24"/>
-          <w:szCs w:val="24"/>
-        </w:rPr>
-      </w:pPr>
-      <w:r>
-        <w:rPr>
-          <w:rFonts w:ascii="Arial" w:hAnsi="Arial" w:cs="Arial"/>
-          <w:sz w:val="24"/>
-          <w:szCs w:val="24"/>
-        </w:rPr>
-        <w:t xml:space="preserve">Nome: {nome}</w:t>
-      </w:r>
-    </w:p>
-    <w:p>
-      <w:pPr>
-        <w:spacing w:before="0" w:after="0" w:line="240" w:lineRule="auto"/>
-        <w:rPr>
-          <w:rFonts w:ascii="Arial" w:hAnsi="Arial" w:cs="Arial"/>
-          <w:sz w:val="24"/>
-          <w:szCs w:val="24"/>
-        </w:rPr>
-      </w:pPr>
-      <w:r>
-        <w:rPr>
-          <w:rFonts w:ascii="Arial" w:hAnsi="Arial" w:cs="Arial"/>
+          <w:rFonts w:ascii="Times New Roman" w:eastAsia="Times New Roman" w:hAnsi="Times New Roman" w:cs="Times New Roman"/>
+          <w:b/>
+          <w:bCs/>
+          <w:sz w:val="28"/>
+          <w:szCs w:val="28"/>
+        </w:rPr>
+      </w:pPr>
+      <w:r>
+        <w:rPr>
+          <w:rFonts w:ascii="Times New Roman" w:eastAsia="Times New Roman" w:hAnsi="Times New Roman" w:cs="Times New Roman"/>
+          <w:b/>
+          <w:bCs/>
+          <w:sz w:val="28"/>
+          <w:szCs w:val="28"/>
+        </w:rPr>
+        <w:t xml:space="preserve">RELATÓRIO FINAL FAMILIAR</w:t>
+      </w:r>
+    </w:p>
+    <w:p>
+      <w:pPr>
+        <w:spacing w:before="0" w:after="0" w:line="276" w:lineRule="auto"/>
+        <w:rPr>
+          <w:rFonts w:ascii="Times New Roman" w:eastAsia="Times New Roman" w:hAnsi="Times New Roman" w:cs="Times New Roman"/>
+          <w:sz w:val="24"/>
+          <w:szCs w:val="24"/>
+        </w:rPr>
+      </w:pPr>
+      <w:r>
+        <w:rPr>
+          <w:rFonts w:ascii="Times New Roman" w:eastAsia="Times New Roman" w:hAnsi="Times New Roman" w:cs="Times New Roman"/>
           <w:sz w:val="24"/>
           <w:szCs w:val="24"/>
         </w:rPr>
@@ -93,63 +45,45 @@
     </w:p>
     <w:p>
       <w:pPr>
-        <w:spacing w:before="0" w:after="0" w:line="240" w:lineRule="auto"/>
-        <w:rPr>
-          <w:rFonts w:ascii="Arial" w:hAnsi="Arial" w:cs="Arial"/>
-          <w:sz w:val="24"/>
-          <w:szCs w:val="24"/>
-        </w:rPr>
-      </w:pPr>
-      <w:r>
-        <w:rPr>
-          <w:rFonts w:ascii="Arial" w:hAnsi="Arial" w:cs="Arial"/>
-          <w:sz w:val="24"/>
-          <w:szCs w:val="24"/>
-        </w:rPr>
-        <w:t xml:space="preserve">CPF: {cpf}        CadÚnico: {nis}</w:t>
-      </w:r>
-    </w:p>
-    <w:p>
-      <w:pPr>
-        <w:spacing w:before="0" w:after="0" w:line="240" w:lineRule="auto"/>
-        <w:rPr>
-          <w:rFonts w:ascii="Arial" w:hAnsi="Arial" w:cs="Arial"/>
-          <w:sz w:val="24"/>
-          <w:szCs w:val="24"/>
-        </w:rPr>
-      </w:pPr>
-      <w:r>
-        <w:rPr>
-          <w:rFonts w:ascii="Arial" w:hAnsi="Arial" w:cs="Arial"/>
-          <w:sz w:val="24"/>
-          <w:szCs w:val="24"/>
-        </w:rPr>
-        <w:t xml:space="preserve">Contato: {contato}        Endereço: {endereco}</w:t>
-      </w:r>
-    </w:p>
-    <w:p>
-      <w:pPr>
-        <w:spacing w:before="0" w:after="0" w:line="240" w:lineRule="auto"/>
-        <w:rPr>
-          <w:rFonts w:ascii="Arial" w:hAnsi="Arial" w:cs="Arial"/>
-          <w:sz w:val="24"/>
-          <w:szCs w:val="24"/>
-        </w:rPr>
-      </w:pPr>
-      <w:r>
-        <w:rPr>
-          <w:rFonts w:ascii="Arial" w:hAnsi="Arial" w:cs="Arial"/>
-          <w:sz w:val="24"/>
-          <w:szCs w:val="24"/>
-        </w:rPr>
-        <w:t xml:space="preserve">Unidade: {unidade}</w:t>
-      </w:r>
-    </w:p>
-    <w:p>
-      <w:pPr>
-        <w:spacing w:before="0" w:after="0" w:line="240" w:lineRule="auto"/>
-        <w:rPr>
-          <w:rFonts w:ascii="Arial" w:hAnsi="Arial" w:cs="Arial"/>
+        <w:spacing w:before="0" w:after="0" w:line="276" w:lineRule="auto"/>
+        <w:rPr>
+          <w:rFonts w:ascii="Times New Roman" w:eastAsia="Times New Roman" w:hAnsi="Times New Roman" w:cs="Times New Roman"/>
+          <w:sz w:val="24"/>
+          <w:szCs w:val="24"/>
+        </w:rPr>
+      </w:pPr>
+      <w:r>
+        <w:rPr>
+          <w:rFonts w:ascii="Times New Roman" w:eastAsia="Times New Roman" w:hAnsi="Times New Roman" w:cs="Times New Roman"/>
+          <w:sz w:val="24"/>
+          <w:szCs w:val="24"/>
+        </w:rPr>
+        <w:t xml:space="preserve">CPF/CadÚnico: {cpfNis}</w:t>
+      </w:r>
+    </w:p>
+    <w:p>
+      <w:pPr>
+        <w:spacing w:before="0" w:after="0" w:line="276" w:lineRule="auto"/>
+        <w:rPr>
+          <w:rFonts w:ascii="Times New Roman" w:eastAsia="Times New Roman" w:hAnsi="Times New Roman" w:cs="Times New Roman"/>
+          <w:sz w:val="24"/>
+          <w:szCs w:val="24"/>
+        </w:rPr>
+      </w:pPr>
+      <w:r>
+        <w:rPr>
+          <w:rFonts w:ascii="Times New Roman" w:eastAsia="Times New Roman" w:hAnsi="Times New Roman" w:cs="Times New Roman"/>
+          <w:sz w:val="24"/>
+          <w:szCs w:val="24"/>
+        </w:rPr>
+        <w:t xml:space="preserve">Contato: {contato}            Endereço: {endereco}</w:t>
+      </w:r>
+    </w:p>
+    <w:p>
+      <w:pPr>
+        <w:spacing w:before="0" w:after="0" w:line="276" w:lineRule="auto"/>
+        <w:rPr>
+          <w:rFonts w:ascii="Times New Roman" w:eastAsia="Times New Roman" w:hAnsi="Times New Roman" w:cs="Times New Roman"/>
           <w:sz w:val="24"/>
           <w:szCs w:val="24"/>
         </w:rPr>
@@ -158,18 +92,18 @@
     <w:p>
       <w:pPr>
         <w:keepNext/>
-        <w:spacing w:before="240" w:after="120" w:line="240" w:lineRule="auto"/>
-        <w:rPr>
-          <w:rFonts w:ascii="Arial" w:hAnsi="Arial" w:cs="Arial"/>
-          <w:b/>
-          <w:bCs/>
-          <w:sz w:val="24"/>
-          <w:szCs w:val="24"/>
-        </w:rPr>
-      </w:pPr>
-      <w:r>
-        <w:rPr>
-          <w:rFonts w:ascii="Arial" w:hAnsi="Arial" w:cs="Arial"/>
+        <w:spacing w:before="240" w:after="120" w:line="276" w:lineRule="auto"/>
+        <w:rPr>
+          <w:rFonts w:ascii="Times New Roman" w:eastAsia="Times New Roman" w:hAnsi="Times New Roman" w:cs="Times New Roman"/>
+          <w:b/>
+          <w:bCs/>
+          <w:sz w:val="24"/>
+          <w:szCs w:val="24"/>
+        </w:rPr>
+      </w:pPr>
+      <w:r>
+        <w:rPr>
+          <w:rFonts w:ascii="Times New Roman" w:eastAsia="Times New Roman" w:hAnsi="Times New Roman" w:cs="Times New Roman"/>
           <w:b/>
           <w:bCs/>
           <w:sz w:val="24"/>
@@ -180,16 +114,16 @@
     </w:p>
     <w:p>
       <w:pPr>
-        <w:spacing w:before="0" w:after="0" w:line="240" w:lineRule="auto"/>
-        <w:rPr>
-          <w:rFonts w:ascii="Arial" w:hAnsi="Arial" w:cs="Arial"/>
-          <w:sz w:val="24"/>
-          <w:szCs w:val="24"/>
-        </w:rPr>
-      </w:pPr>
-      <w:r>
-        <w:rPr>
-          <w:rFonts w:ascii="Arial" w:hAnsi="Arial" w:cs="Arial"/>
+        <w:spacing w:before="0" w:after="0" w:line="276" w:lineRule="auto"/>
+        <w:rPr>
+          <w:rFonts w:ascii="Times New Roman" w:eastAsia="Times New Roman" w:hAnsi="Times New Roman" w:cs="Times New Roman"/>
+          <w:sz w:val="24"/>
+          <w:szCs w:val="24"/>
+        </w:rPr>
+      </w:pPr>
+      <w:r>
+        <w:rPr>
+          <w:rFonts w:ascii="Times New Roman" w:eastAsia="Times New Roman" w:hAnsi="Times New Roman" w:cs="Times New Roman"/>
           <w:sz w:val="24"/>
           <w:szCs w:val="24"/>
         </w:rPr>
@@ -201,14 +135,14 @@
         <w:spacing w:before="0" w:after="120" w:line="360" w:lineRule="auto"/>
         <w:jc w:val="both"/>
         <w:rPr>
-          <w:rFonts w:ascii="Arial" w:hAnsi="Arial" w:cs="Arial"/>
-          <w:sz w:val="24"/>
-          <w:szCs w:val="24"/>
-        </w:rPr>
-      </w:pPr>
-      <w:r>
-        <w:rPr>
-          <w:rFonts w:ascii="Arial" w:hAnsi="Arial" w:cs="Arial"/>
+          <w:rFonts w:ascii="Times New Roman" w:eastAsia="Times New Roman" w:hAnsi="Times New Roman" w:cs="Times New Roman"/>
+          <w:sz w:val="24"/>
+          <w:szCs w:val="24"/>
+        </w:rPr>
+      </w:pPr>
+      <w:r>
+        <w:rPr>
+          <w:rFonts w:ascii="Times New Roman" w:eastAsia="Times New Roman" w:hAnsi="Times New Roman" w:cs="Times New Roman"/>
           <w:sz w:val="24"/>
           <w:szCs w:val="24"/>
         </w:rPr>
@@ -217,16 +151,16 @@
     </w:p>
     <w:p>
       <w:pPr>
-        <w:spacing w:before="0" w:after="0" w:line="240" w:lineRule="auto"/>
-        <w:rPr>
-          <w:rFonts w:ascii="Arial" w:hAnsi="Arial" w:cs="Arial"/>
-          <w:sz w:val="24"/>
-          <w:szCs w:val="24"/>
-        </w:rPr>
-      </w:pPr>
-      <w:r>
-        <w:rPr>
-          <w:rFonts w:ascii="Arial" w:hAnsi="Arial" w:cs="Arial"/>
+        <w:spacing w:before="0" w:after="0" w:line="276" w:lineRule="auto"/>
+        <w:rPr>
+          <w:rFonts w:ascii="Times New Roman" w:eastAsia="Times New Roman" w:hAnsi="Times New Roman" w:cs="Times New Roman"/>
+          <w:sz w:val="24"/>
+          <w:szCs w:val="24"/>
+        </w:rPr>
+      </w:pPr>
+      <w:r>
+        <w:rPr>
+          <w:rFonts w:ascii="Times New Roman" w:eastAsia="Times New Roman" w:hAnsi="Times New Roman" w:cs="Times New Roman"/>
           <w:sz w:val="24"/>
           <w:szCs w:val="24"/>
         </w:rPr>
@@ -236,18 +170,18 @@
     <w:p>
       <w:pPr>
         <w:keepNext/>
-        <w:spacing w:before="240" w:after="120" w:line="240" w:lineRule="auto"/>
-        <w:rPr>
-          <w:rFonts w:ascii="Arial" w:hAnsi="Arial" w:cs="Arial"/>
-          <w:b/>
-          <w:bCs/>
-          <w:sz w:val="24"/>
-          <w:szCs w:val="24"/>
-        </w:rPr>
-      </w:pPr>
-      <w:r>
-        <w:rPr>
-          <w:rFonts w:ascii="Arial" w:hAnsi="Arial" w:cs="Arial"/>
+        <w:spacing w:before="240" w:after="120" w:line="276" w:lineRule="auto"/>
+        <w:rPr>
+          <w:rFonts w:ascii="Times New Roman" w:eastAsia="Times New Roman" w:hAnsi="Times New Roman" w:cs="Times New Roman"/>
+          <w:b/>
+          <w:bCs/>
+          <w:sz w:val="24"/>
+          <w:szCs w:val="24"/>
+        </w:rPr>
+      </w:pPr>
+      <w:r>
+        <w:rPr>
+          <w:rFonts w:ascii="Times New Roman" w:eastAsia="Times New Roman" w:hAnsi="Times New Roman" w:cs="Times New Roman"/>
           <w:b/>
           <w:bCs/>
           <w:sz w:val="24"/>
@@ -258,16 +192,16 @@
     </w:p>
     <w:p>
       <w:pPr>
-        <w:spacing w:before="0" w:after="0" w:line="240" w:lineRule="auto"/>
-        <w:rPr>
-          <w:rFonts w:ascii="Arial" w:hAnsi="Arial" w:cs="Arial"/>
-          <w:sz w:val="24"/>
-          <w:szCs w:val="24"/>
-        </w:rPr>
-      </w:pPr>
-      <w:r>
-        <w:rPr>
-          <w:rFonts w:ascii="Arial" w:hAnsi="Arial" w:cs="Arial"/>
+        <w:spacing w:before="0" w:after="0" w:line="276" w:lineRule="auto"/>
+        <w:rPr>
+          <w:rFonts w:ascii="Times New Roman" w:eastAsia="Times New Roman" w:hAnsi="Times New Roman" w:cs="Times New Roman"/>
+          <w:sz w:val="24"/>
+          <w:szCs w:val="24"/>
+        </w:rPr>
+      </w:pPr>
+      <w:r>
+        <w:rPr>
+          <w:rFonts w:ascii="Times New Roman" w:eastAsia="Times New Roman" w:hAnsi="Times New Roman" w:cs="Times New Roman"/>
           <w:sz w:val="24"/>
           <w:szCs w:val="24"/>
         </w:rPr>
@@ -279,14 +213,14 @@
         <w:spacing w:before="0" w:after="120" w:line="360" w:lineRule="auto"/>
         <w:jc w:val="both"/>
         <w:rPr>
-          <w:rFonts w:ascii="Arial" w:hAnsi="Arial" w:cs="Arial"/>
-          <w:sz w:val="24"/>
-          <w:szCs w:val="24"/>
-        </w:rPr>
-      </w:pPr>
-      <w:r>
-        <w:rPr>
-          <w:rFonts w:ascii="Arial" w:hAnsi="Arial" w:cs="Arial"/>
+          <w:rFonts w:ascii="Times New Roman" w:eastAsia="Times New Roman" w:hAnsi="Times New Roman" w:cs="Times New Roman"/>
+          <w:sz w:val="24"/>
+          <w:szCs w:val="24"/>
+        </w:rPr>
+      </w:pPr>
+      <w:r>
+        <w:rPr>
+          <w:rFonts w:ascii="Times New Roman" w:eastAsia="Times New Roman" w:hAnsi="Times New Roman" w:cs="Times New Roman"/>
           <w:sz w:val="24"/>
           <w:szCs w:val="24"/>
         </w:rPr>
@@ -295,16 +229,16 @@
     </w:p>
     <w:p>
       <w:pPr>
-        <w:spacing w:before="0" w:after="0" w:line="240" w:lineRule="auto"/>
-        <w:rPr>
-          <w:rFonts w:ascii="Arial" w:hAnsi="Arial" w:cs="Arial"/>
-          <w:sz w:val="24"/>
-          <w:szCs w:val="24"/>
-        </w:rPr>
-      </w:pPr>
-      <w:r>
-        <w:rPr>
-          <w:rFonts w:ascii="Arial" w:hAnsi="Arial" w:cs="Arial"/>
+        <w:spacing w:before="0" w:after="0" w:line="276" w:lineRule="auto"/>
+        <w:rPr>
+          <w:rFonts w:ascii="Times New Roman" w:eastAsia="Times New Roman" w:hAnsi="Times New Roman" w:cs="Times New Roman"/>
+          <w:sz w:val="24"/>
+          <w:szCs w:val="24"/>
+        </w:rPr>
+      </w:pPr>
+      <w:r>
+        <w:rPr>
+          <w:rFonts w:ascii="Times New Roman" w:eastAsia="Times New Roman" w:hAnsi="Times New Roman" w:cs="Times New Roman"/>
           <w:sz w:val="24"/>
           <w:szCs w:val="24"/>
         </w:rPr>
@@ -314,18 +248,18 @@
     <w:p>
       <w:pPr>
         <w:keepNext/>
-        <w:spacing w:before="240" w:after="120" w:line="240" w:lineRule="auto"/>
-        <w:rPr>
-          <w:rFonts w:ascii="Arial" w:hAnsi="Arial" w:cs="Arial"/>
-          <w:b/>
-          <w:bCs/>
-          <w:sz w:val="24"/>
-          <w:szCs w:val="24"/>
-        </w:rPr>
-      </w:pPr>
-      <w:r>
-        <w:rPr>
-          <w:rFonts w:ascii="Arial" w:hAnsi="Arial" w:cs="Arial"/>
+        <w:spacing w:before="240" w:after="120" w:line="276" w:lineRule="auto"/>
+        <w:rPr>
+          <w:rFonts w:ascii="Times New Roman" w:eastAsia="Times New Roman" w:hAnsi="Times New Roman" w:cs="Times New Roman"/>
+          <w:b/>
+          <w:bCs/>
+          <w:sz w:val="24"/>
+          <w:szCs w:val="24"/>
+        </w:rPr>
+      </w:pPr>
+      <w:r>
+        <w:rPr>
+          <w:rFonts w:ascii="Times New Roman" w:eastAsia="Times New Roman" w:hAnsi="Times New Roman" w:cs="Times New Roman"/>
           <w:b/>
           <w:bCs/>
           <w:sz w:val="24"/>
@@ -336,16 +270,16 @@
     </w:p>
     <w:p>
       <w:pPr>
-        <w:spacing w:before="0" w:after="0" w:line="240" w:lineRule="auto"/>
-        <w:rPr>
-          <w:rFonts w:ascii="Arial" w:hAnsi="Arial" w:cs="Arial"/>
-          <w:sz w:val="24"/>
-          <w:szCs w:val="24"/>
-        </w:rPr>
-      </w:pPr>
-      <w:r>
-        <w:rPr>
-          <w:rFonts w:ascii="Arial" w:hAnsi="Arial" w:cs="Arial"/>
+        <w:spacing w:before="0" w:after="0" w:line="276" w:lineRule="auto"/>
+        <w:rPr>
+          <w:rFonts w:ascii="Times New Roman" w:eastAsia="Times New Roman" w:hAnsi="Times New Roman" w:cs="Times New Roman"/>
+          <w:sz w:val="24"/>
+          <w:szCs w:val="24"/>
+        </w:rPr>
+      </w:pPr>
+      <w:r>
+        <w:rPr>
+          <w:rFonts w:ascii="Times New Roman" w:eastAsia="Times New Roman" w:hAnsi="Times New Roman" w:cs="Times New Roman"/>
           <w:sz w:val="24"/>
           <w:szCs w:val="24"/>
         </w:rPr>
@@ -357,14 +291,14 @@
         <w:spacing w:before="0" w:after="120" w:line="360" w:lineRule="auto"/>
         <w:jc w:val="both"/>
         <w:rPr>
-          <w:rFonts w:ascii="Arial" w:hAnsi="Arial" w:cs="Arial"/>
-          <w:sz w:val="24"/>
-          <w:szCs w:val="24"/>
-        </w:rPr>
-      </w:pPr>
-      <w:r>
-        <w:rPr>
-          <w:rFonts w:ascii="Arial" w:hAnsi="Arial" w:cs="Arial"/>
+          <w:rFonts w:ascii="Times New Roman" w:eastAsia="Times New Roman" w:hAnsi="Times New Roman" w:cs="Times New Roman"/>
+          <w:sz w:val="24"/>
+          <w:szCs w:val="24"/>
+        </w:rPr>
+      </w:pPr>
+      <w:r>
+        <w:rPr>
+          <w:rFonts w:ascii="Times New Roman" w:eastAsia="Times New Roman" w:hAnsi="Times New Roman" w:cs="Times New Roman"/>
           <w:sz w:val="24"/>
           <w:szCs w:val="24"/>
         </w:rPr>
@@ -373,16 +307,16 @@
     </w:p>
     <w:p>
       <w:pPr>
-        <w:spacing w:before="0" w:after="0" w:line="240" w:lineRule="auto"/>
-        <w:rPr>
-          <w:rFonts w:ascii="Arial" w:hAnsi="Arial" w:cs="Arial"/>
-          <w:sz w:val="24"/>
-          <w:szCs w:val="24"/>
-        </w:rPr>
-      </w:pPr>
-      <w:r>
-        <w:rPr>
-          <w:rFonts w:ascii="Arial" w:hAnsi="Arial" w:cs="Arial"/>
+        <w:spacing w:before="0" w:after="0" w:line="276" w:lineRule="auto"/>
+        <w:rPr>
+          <w:rFonts w:ascii="Times New Roman" w:eastAsia="Times New Roman" w:hAnsi="Times New Roman" w:cs="Times New Roman"/>
+          <w:sz w:val="24"/>
+          <w:szCs w:val="24"/>
+        </w:rPr>
+      </w:pPr>
+      <w:r>
+        <w:rPr>
+          <w:rFonts w:ascii="Times New Roman" w:eastAsia="Times New Roman" w:hAnsi="Times New Roman" w:cs="Times New Roman"/>
           <w:sz w:val="24"/>
           <w:szCs w:val="24"/>
         </w:rPr>
@@ -392,18 +326,18 @@
     <w:p>
       <w:pPr>
         <w:keepNext/>
-        <w:spacing w:before="240" w:after="120" w:line="240" w:lineRule="auto"/>
-        <w:rPr>
-          <w:rFonts w:ascii="Arial" w:hAnsi="Arial" w:cs="Arial"/>
-          <w:b/>
-          <w:bCs/>
-          <w:sz w:val="24"/>
-          <w:szCs w:val="24"/>
-        </w:rPr>
-      </w:pPr>
-      <w:r>
-        <w:rPr>
-          <w:rFonts w:ascii="Arial" w:hAnsi="Arial" w:cs="Arial"/>
+        <w:spacing w:before="240" w:after="120" w:line="276" w:lineRule="auto"/>
+        <w:rPr>
+          <w:rFonts w:ascii="Times New Roman" w:eastAsia="Times New Roman" w:hAnsi="Times New Roman" w:cs="Times New Roman"/>
+          <w:b/>
+          <w:bCs/>
+          <w:sz w:val="24"/>
+          <w:szCs w:val="24"/>
+        </w:rPr>
+      </w:pPr>
+      <w:r>
+        <w:rPr>
+          <w:rFonts w:ascii="Times New Roman" w:eastAsia="Times New Roman" w:hAnsi="Times New Roman" w:cs="Times New Roman"/>
           <w:b/>
           <w:bCs/>
           <w:sz w:val="24"/>
@@ -415,18 +349,18 @@
     <w:p>
       <w:pPr>
         <w:keepNext/>
-        <w:spacing w:before="120" w:after="60" w:line="240" w:lineRule="auto"/>
-        <w:rPr>
-          <w:rFonts w:ascii="Arial" w:hAnsi="Arial" w:cs="Arial"/>
-          <w:b/>
-          <w:bCs/>
-          <w:sz w:val="24"/>
-          <w:szCs w:val="24"/>
-        </w:rPr>
-      </w:pPr>
-      <w:r>
-        <w:rPr>
-          <w:rFonts w:ascii="Arial" w:hAnsi="Arial" w:cs="Arial"/>
+        <w:spacing w:before="120" w:after="60" w:line="276" w:lineRule="auto"/>
+        <w:rPr>
+          <w:rFonts w:ascii="Times New Roman" w:eastAsia="Times New Roman" w:hAnsi="Times New Roman" w:cs="Times New Roman"/>
+          <w:b/>
+          <w:bCs/>
+          <w:sz w:val="24"/>
+          <w:szCs w:val="24"/>
+        </w:rPr>
+      </w:pPr>
+      <w:r>
+        <w:rPr>
+          <w:rFonts w:ascii="Times New Roman" w:eastAsia="Times New Roman" w:hAnsi="Times New Roman" w:cs="Times New Roman"/>
           <w:b/>
           <w:bCs/>
           <w:sz w:val="24"/>
@@ -437,16 +371,16 @@
     </w:p>
     <w:p>
       <w:pPr>
-        <w:spacing w:before="0" w:after="0" w:line="240" w:lineRule="auto"/>
-        <w:rPr>
-          <w:rFonts w:ascii="Arial" w:hAnsi="Arial" w:cs="Arial"/>
-          <w:sz w:val="24"/>
-          <w:szCs w:val="24"/>
-        </w:rPr>
-      </w:pPr>
-      <w:r>
-        <w:rPr>
-          <w:rFonts w:ascii="Arial" w:hAnsi="Arial" w:cs="Arial"/>
+        <w:spacing w:before="0" w:after="0" w:line="276" w:lineRule="auto"/>
+        <w:rPr>
+          <w:rFonts w:ascii="Times New Roman" w:eastAsia="Times New Roman" w:hAnsi="Times New Roman" w:cs="Times New Roman"/>
+          <w:sz w:val="24"/>
+          <w:szCs w:val="24"/>
+        </w:rPr>
+      </w:pPr>
+      <w:r>
+        <w:rPr>
+          <w:rFonts w:ascii="Times New Roman" w:eastAsia="Times New Roman" w:hAnsi="Times New Roman" w:cs="Times New Roman"/>
           <w:sz w:val="24"/>
           <w:szCs w:val="24"/>
         </w:rPr>
@@ -458,14 +392,14 @@
         <w:spacing w:before="0" w:after="120" w:line="360" w:lineRule="auto"/>
         <w:jc w:val="both"/>
         <w:rPr>
-          <w:rFonts w:ascii="Arial" w:hAnsi="Arial" w:cs="Arial"/>
-          <w:sz w:val="24"/>
-          <w:szCs w:val="24"/>
-        </w:rPr>
-      </w:pPr>
-      <w:r>
-        <w:rPr>
-          <w:rFonts w:ascii="Arial" w:hAnsi="Arial" w:cs="Arial"/>
+          <w:rFonts w:ascii="Times New Roman" w:eastAsia="Times New Roman" w:hAnsi="Times New Roman" w:cs="Times New Roman"/>
+          <w:sz w:val="24"/>
+          <w:szCs w:val="24"/>
+        </w:rPr>
+      </w:pPr>
+      <w:r>
+        <w:rPr>
+          <w:rFonts w:ascii="Times New Roman" w:eastAsia="Times New Roman" w:hAnsi="Times New Roman" w:cs="Times New Roman"/>
           <w:sz w:val="24"/>
           <w:szCs w:val="24"/>
         </w:rPr>
@@ -474,16 +408,16 @@
     </w:p>
     <w:p>
       <w:pPr>
-        <w:spacing w:before="0" w:after="0" w:line="240" w:lineRule="auto"/>
-        <w:rPr>
-          <w:rFonts w:ascii="Arial" w:hAnsi="Arial" w:cs="Arial"/>
-          <w:sz w:val="24"/>
-          <w:szCs w:val="24"/>
-        </w:rPr>
-      </w:pPr>
-      <w:r>
-        <w:rPr>
-          <w:rFonts w:ascii="Arial" w:hAnsi="Arial" w:cs="Arial"/>
+        <w:spacing w:before="0" w:after="0" w:line="276" w:lineRule="auto"/>
+        <w:rPr>
+          <w:rFonts w:ascii="Times New Roman" w:eastAsia="Times New Roman" w:hAnsi="Times New Roman" w:cs="Times New Roman"/>
+          <w:sz w:val="24"/>
+          <w:szCs w:val="24"/>
+        </w:rPr>
+      </w:pPr>
+      <w:r>
+        <w:rPr>
+          <w:rFonts w:ascii="Times New Roman" w:eastAsia="Times New Roman" w:hAnsi="Times New Roman" w:cs="Times New Roman"/>
           <w:sz w:val="24"/>
           <w:szCs w:val="24"/>
         </w:rPr>
@@ -493,18 +427,18 @@
     <w:p>
       <w:pPr>
         <w:keepNext/>
-        <w:spacing w:before="240" w:after="120" w:line="240" w:lineRule="auto"/>
-        <w:rPr>
-          <w:rFonts w:ascii="Arial" w:hAnsi="Arial" w:cs="Arial"/>
-          <w:b/>
-          <w:bCs/>
-          <w:sz w:val="24"/>
-          <w:szCs w:val="24"/>
-        </w:rPr>
-      </w:pPr>
-      <w:r>
-        <w:rPr>
-          <w:rFonts w:ascii="Arial" w:hAnsi="Arial" w:cs="Arial"/>
+        <w:spacing w:before="240" w:after="120" w:line="276" w:lineRule="auto"/>
+        <w:rPr>
+          <w:rFonts w:ascii="Times New Roman" w:eastAsia="Times New Roman" w:hAnsi="Times New Roman" w:cs="Times New Roman"/>
+          <w:b/>
+          <w:bCs/>
+          <w:sz w:val="24"/>
+          <w:szCs w:val="24"/>
+        </w:rPr>
+      </w:pPr>
+      <w:r>
+        <w:rPr>
+          <w:rFonts w:ascii="Times New Roman" w:eastAsia="Times New Roman" w:hAnsi="Times New Roman" w:cs="Times New Roman"/>
           <w:b/>
           <w:bCs/>
           <w:sz w:val="24"/>
@@ -516,18 +450,18 @@
     <w:p>
       <w:pPr>
         <w:keepNext/>
-        <w:spacing w:before="120" w:after="60" w:line="240" w:lineRule="auto"/>
-        <w:rPr>
-          <w:rFonts w:ascii="Arial" w:hAnsi="Arial" w:cs="Arial"/>
-          <w:b/>
-          <w:bCs/>
-          <w:sz w:val="24"/>
-          <w:szCs w:val="24"/>
-        </w:rPr>
-      </w:pPr>
-      <w:r>
-        <w:rPr>
-          <w:rFonts w:ascii="Arial" w:hAnsi="Arial" w:cs="Arial"/>
+        <w:spacing w:before="120" w:after="60" w:line="276" w:lineRule="auto"/>
+        <w:rPr>
+          <w:rFonts w:ascii="Times New Roman" w:eastAsia="Times New Roman" w:hAnsi="Times New Roman" w:cs="Times New Roman"/>
+          <w:b/>
+          <w:bCs/>
+          <w:sz w:val="24"/>
+          <w:szCs w:val="24"/>
+        </w:rPr>
+      </w:pPr>
+      <w:r>
+        <w:rPr>
+          <w:rFonts w:ascii="Times New Roman" w:eastAsia="Times New Roman" w:hAnsi="Times New Roman" w:cs="Times New Roman"/>
           <w:b/>
           <w:bCs/>
           <w:sz w:val="24"/>
@@ -538,16 +472,16 @@
     </w:p>
     <w:p>
       <w:pPr>
-        <w:spacing w:before="0" w:after="0" w:line="240" w:lineRule="auto"/>
-        <w:rPr>
-          <w:rFonts w:ascii="Arial" w:hAnsi="Arial" w:cs="Arial"/>
-          <w:sz w:val="24"/>
-          <w:szCs w:val="24"/>
-        </w:rPr>
-      </w:pPr>
-      <w:r>
-        <w:rPr>
-          <w:rFonts w:ascii="Arial" w:hAnsi="Arial" w:cs="Arial"/>
+        <w:spacing w:before="0" w:after="0" w:line="276" w:lineRule="auto"/>
+        <w:rPr>
+          <w:rFonts w:ascii="Times New Roman" w:eastAsia="Times New Roman" w:hAnsi="Times New Roman" w:cs="Times New Roman"/>
+          <w:sz w:val="24"/>
+          <w:szCs w:val="24"/>
+        </w:rPr>
+      </w:pPr>
+      <w:r>
+        <w:rPr>
+          <w:rFonts w:ascii="Times New Roman" w:eastAsia="Times New Roman" w:hAnsi="Times New Roman" w:cs="Times New Roman"/>
           <w:sz w:val="24"/>
           <w:szCs w:val="24"/>
         </w:rPr>
@@ -559,14 +493,14 @@
         <w:spacing w:before="0" w:after="120" w:line="360" w:lineRule="auto"/>
         <w:jc w:val="both"/>
         <w:rPr>
-          <w:rFonts w:ascii="Arial" w:hAnsi="Arial" w:cs="Arial"/>
-          <w:sz w:val="24"/>
-          <w:szCs w:val="24"/>
-        </w:rPr>
-      </w:pPr>
-      <w:r>
-        <w:rPr>
-          <w:rFonts w:ascii="Arial" w:hAnsi="Arial" w:cs="Arial"/>
+          <w:rFonts w:ascii="Times New Roman" w:eastAsia="Times New Roman" w:hAnsi="Times New Roman" w:cs="Times New Roman"/>
+          <w:sz w:val="24"/>
+          <w:szCs w:val="24"/>
+        </w:rPr>
+      </w:pPr>
+      <w:r>
+        <w:rPr>
+          <w:rFonts w:ascii="Times New Roman" w:eastAsia="Times New Roman" w:hAnsi="Times New Roman" w:cs="Times New Roman"/>
           <w:sz w:val="24"/>
           <w:szCs w:val="24"/>
         </w:rPr>
@@ -575,16 +509,16 @@
     </w:p>
     <w:p>
       <w:pPr>
-        <w:spacing w:before="0" w:after="0" w:line="240" w:lineRule="auto"/>
-        <w:rPr>
-          <w:rFonts w:ascii="Arial" w:hAnsi="Arial" w:cs="Arial"/>
-          <w:sz w:val="24"/>
-          <w:szCs w:val="24"/>
-        </w:rPr>
-      </w:pPr>
-      <w:r>
-        <w:rPr>
-          <w:rFonts w:ascii="Arial" w:hAnsi="Arial" w:cs="Arial"/>
+        <w:spacing w:before="0" w:after="0" w:line="276" w:lineRule="auto"/>
+        <w:rPr>
+          <w:rFonts w:ascii="Times New Roman" w:eastAsia="Times New Roman" w:hAnsi="Times New Roman" w:cs="Times New Roman"/>
+          <w:sz w:val="24"/>
+          <w:szCs w:val="24"/>
+        </w:rPr>
+      </w:pPr>
+      <w:r>
+        <w:rPr>
+          <w:rFonts w:ascii="Times New Roman" w:eastAsia="Times New Roman" w:hAnsi="Times New Roman" w:cs="Times New Roman"/>
           <w:sz w:val="24"/>
           <w:szCs w:val="24"/>
         </w:rPr>
@@ -594,18 +528,18 @@
     <w:p>
       <w:pPr>
         <w:keepNext/>
-        <w:spacing w:before="120" w:after="60" w:line="240" w:lineRule="auto"/>
-        <w:rPr>
-          <w:rFonts w:ascii="Arial" w:hAnsi="Arial" w:cs="Arial"/>
-          <w:b/>
-          <w:bCs/>
-          <w:sz w:val="24"/>
-          <w:szCs w:val="24"/>
-        </w:rPr>
-      </w:pPr>
-      <w:r>
-        <w:rPr>
-          <w:rFonts w:ascii="Arial" w:hAnsi="Arial" w:cs="Arial"/>
+        <w:spacing w:before="120" w:after="60" w:line="276" w:lineRule="auto"/>
+        <w:rPr>
+          <w:rFonts w:ascii="Times New Roman" w:eastAsia="Times New Roman" w:hAnsi="Times New Roman" w:cs="Times New Roman"/>
+          <w:b/>
+          <w:bCs/>
+          <w:sz w:val="24"/>
+          <w:szCs w:val="24"/>
+        </w:rPr>
+      </w:pPr>
+      <w:r>
+        <w:rPr>
+          <w:rFonts w:ascii="Times New Roman" w:eastAsia="Times New Roman" w:hAnsi="Times New Roman" w:cs="Times New Roman"/>
           <w:b/>
           <w:bCs/>
           <w:sz w:val="24"/>
@@ -616,16 +550,16 @@
     </w:p>
     <w:p>
       <w:pPr>
-        <w:spacing w:before="0" w:after="0" w:line="240" w:lineRule="auto"/>
-        <w:rPr>
-          <w:rFonts w:ascii="Arial" w:hAnsi="Arial" w:cs="Arial"/>
-          <w:sz w:val="24"/>
-          <w:szCs w:val="24"/>
-        </w:rPr>
-      </w:pPr>
-      <w:r>
-        <w:rPr>
-          <w:rFonts w:ascii="Arial" w:hAnsi="Arial" w:cs="Arial"/>
+        <w:spacing w:before="0" w:after="0" w:line="276" w:lineRule="auto"/>
+        <w:rPr>
+          <w:rFonts w:ascii="Times New Roman" w:eastAsia="Times New Roman" w:hAnsi="Times New Roman" w:cs="Times New Roman"/>
+          <w:sz w:val="24"/>
+          <w:szCs w:val="24"/>
+        </w:rPr>
+      </w:pPr>
+      <w:r>
+        <w:rPr>
+          <w:rFonts w:ascii="Times New Roman" w:eastAsia="Times New Roman" w:hAnsi="Times New Roman" w:cs="Times New Roman"/>
           <w:sz w:val="24"/>
           <w:szCs w:val="24"/>
         </w:rPr>
@@ -637,14 +571,14 @@
         <w:spacing w:before="0" w:after="120" w:line="360" w:lineRule="auto"/>
         <w:jc w:val="both"/>
         <w:rPr>
-          <w:rFonts w:ascii="Arial" w:hAnsi="Arial" w:cs="Arial"/>
-          <w:sz w:val="24"/>
-          <w:szCs w:val="24"/>
-        </w:rPr>
-      </w:pPr>
-      <w:r>
-        <w:rPr>
-          <w:rFonts w:ascii="Arial" w:hAnsi="Arial" w:cs="Arial"/>
+          <w:rFonts w:ascii="Times New Roman" w:eastAsia="Times New Roman" w:hAnsi="Times New Roman" w:cs="Times New Roman"/>
+          <w:sz w:val="24"/>
+          <w:szCs w:val="24"/>
+        </w:rPr>
+      </w:pPr>
+      <w:r>
+        <w:rPr>
+          <w:rFonts w:ascii="Times New Roman" w:eastAsia="Times New Roman" w:hAnsi="Times New Roman" w:cs="Times New Roman"/>
           <w:sz w:val="24"/>
           <w:szCs w:val="24"/>
         </w:rPr>
@@ -653,16 +587,16 @@
     </w:p>
     <w:p>
       <w:pPr>
-        <w:spacing w:before="0" w:after="0" w:line="240" w:lineRule="auto"/>
-        <w:rPr>
-          <w:rFonts w:ascii="Arial" w:hAnsi="Arial" w:cs="Arial"/>
-          <w:sz w:val="24"/>
-          <w:szCs w:val="24"/>
-        </w:rPr>
-      </w:pPr>
-      <w:r>
-        <w:rPr>
-          <w:rFonts w:ascii="Arial" w:hAnsi="Arial" w:cs="Arial"/>
+        <w:spacing w:before="0" w:after="0" w:line="276" w:lineRule="auto"/>
+        <w:rPr>
+          <w:rFonts w:ascii="Times New Roman" w:eastAsia="Times New Roman" w:hAnsi="Times New Roman" w:cs="Times New Roman"/>
+          <w:sz w:val="24"/>
+          <w:szCs w:val="24"/>
+        </w:rPr>
+      </w:pPr>
+      <w:r>
+        <w:rPr>
+          <w:rFonts w:ascii="Times New Roman" w:eastAsia="Times New Roman" w:hAnsi="Times New Roman" w:cs="Times New Roman"/>
           <w:sz w:val="24"/>
           <w:szCs w:val="24"/>
         </w:rPr>
@@ -672,18 +606,18 @@
     <w:p>
       <w:pPr>
         <w:keepNext/>
-        <w:spacing w:before="120" w:after="60" w:line="240" w:lineRule="auto"/>
-        <w:rPr>
-          <w:rFonts w:ascii="Arial" w:hAnsi="Arial" w:cs="Arial"/>
-          <w:b/>
-          <w:bCs/>
-          <w:sz w:val="24"/>
-          <w:szCs w:val="24"/>
-        </w:rPr>
-      </w:pPr>
-      <w:r>
-        <w:rPr>
-          <w:rFonts w:ascii="Arial" w:hAnsi="Arial" w:cs="Arial"/>
+        <w:spacing w:before="120" w:after="60" w:line="276" w:lineRule="auto"/>
+        <w:rPr>
+          <w:rFonts w:ascii="Times New Roman" w:eastAsia="Times New Roman" w:hAnsi="Times New Roman" w:cs="Times New Roman"/>
+          <w:b/>
+          <w:bCs/>
+          <w:sz w:val="24"/>
+          <w:szCs w:val="24"/>
+        </w:rPr>
+      </w:pPr>
+      <w:r>
+        <w:rPr>
+          <w:rFonts w:ascii="Times New Roman" w:eastAsia="Times New Roman" w:hAnsi="Times New Roman" w:cs="Times New Roman"/>
           <w:b/>
           <w:bCs/>
           <w:sz w:val="24"/>
@@ -694,16 +628,16 @@
     </w:p>
     <w:p>
       <w:pPr>
-        <w:spacing w:before="0" w:after="0" w:line="240" w:lineRule="auto"/>
-        <w:rPr>
-          <w:rFonts w:ascii="Arial" w:hAnsi="Arial" w:cs="Arial"/>
-          <w:sz w:val="24"/>
-          <w:szCs w:val="24"/>
-        </w:rPr>
-      </w:pPr>
-      <w:r>
-        <w:rPr>
-          <w:rFonts w:ascii="Arial" w:hAnsi="Arial" w:cs="Arial"/>
+        <w:spacing w:before="0" w:after="0" w:line="276" w:lineRule="auto"/>
+        <w:rPr>
+          <w:rFonts w:ascii="Times New Roman" w:eastAsia="Times New Roman" w:hAnsi="Times New Roman" w:cs="Times New Roman"/>
+          <w:sz w:val="24"/>
+          <w:szCs w:val="24"/>
+        </w:rPr>
+      </w:pPr>
+      <w:r>
+        <w:rPr>
+          <w:rFonts w:ascii="Times New Roman" w:eastAsia="Times New Roman" w:hAnsi="Times New Roman" w:cs="Times New Roman"/>
           <w:sz w:val="24"/>
           <w:szCs w:val="24"/>
         </w:rPr>
@@ -715,14 +649,14 @@
         <w:spacing w:before="0" w:after="120" w:line="360" w:lineRule="auto"/>
         <w:jc w:val="both"/>
         <w:rPr>
-          <w:rFonts w:ascii="Arial" w:hAnsi="Arial" w:cs="Arial"/>
-          <w:sz w:val="24"/>
-          <w:szCs w:val="24"/>
-        </w:rPr>
-      </w:pPr>
-      <w:r>
-        <w:rPr>
-          <w:rFonts w:ascii="Arial" w:hAnsi="Arial" w:cs="Arial"/>
+          <w:rFonts w:ascii="Times New Roman" w:eastAsia="Times New Roman" w:hAnsi="Times New Roman" w:cs="Times New Roman"/>
+          <w:sz w:val="24"/>
+          <w:szCs w:val="24"/>
+        </w:rPr>
+      </w:pPr>
+      <w:r>
+        <w:rPr>
+          <w:rFonts w:ascii="Times New Roman" w:eastAsia="Times New Roman" w:hAnsi="Times New Roman" w:cs="Times New Roman"/>
           <w:sz w:val="24"/>
           <w:szCs w:val="24"/>
         </w:rPr>
@@ -731,16 +665,16 @@
     </w:p>
     <w:p>
       <w:pPr>
-        <w:spacing w:before="0" w:after="0" w:line="240" w:lineRule="auto"/>
-        <w:rPr>
-          <w:rFonts w:ascii="Arial" w:hAnsi="Arial" w:cs="Arial"/>
-          <w:sz w:val="24"/>
-          <w:szCs w:val="24"/>
-        </w:rPr>
-      </w:pPr>
-      <w:r>
-        <w:rPr>
-          <w:rFonts w:ascii="Arial" w:hAnsi="Arial" w:cs="Arial"/>
+        <w:spacing w:before="0" w:after="0" w:line="276" w:lineRule="auto"/>
+        <w:rPr>
+          <w:rFonts w:ascii="Times New Roman" w:eastAsia="Times New Roman" w:hAnsi="Times New Roman" w:cs="Times New Roman"/>
+          <w:sz w:val="24"/>
+          <w:szCs w:val="24"/>
+        </w:rPr>
+      </w:pPr>
+      <w:r>
+        <w:rPr>
+          <w:rFonts w:ascii="Times New Roman" w:eastAsia="Times New Roman" w:hAnsi="Times New Roman" w:cs="Times New Roman"/>
           <w:sz w:val="24"/>
           <w:szCs w:val="24"/>
         </w:rPr>
@@ -749,16 +683,16 @@
     </w:p>
     <w:p>
       <w:pPr>
-        <w:spacing w:before="0" w:after="0" w:line="240" w:lineRule="auto"/>
-        <w:rPr>
-          <w:rFonts w:ascii="Arial" w:hAnsi="Arial" w:cs="Arial"/>
-          <w:sz w:val="24"/>
-          <w:szCs w:val="24"/>
-        </w:rPr>
-      </w:pPr>
-      <w:r>
-        <w:rPr>
-          <w:rFonts w:ascii="Arial" w:hAnsi="Arial" w:cs="Arial"/>
+        <w:spacing w:before="0" w:after="0" w:line="276" w:lineRule="auto"/>
+        <w:rPr>
+          <w:rFonts w:ascii="Times New Roman" w:eastAsia="Times New Roman" w:hAnsi="Times New Roman" w:cs="Times New Roman"/>
+          <w:sz w:val="24"/>
+          <w:szCs w:val="24"/>
+        </w:rPr>
+      </w:pPr>
+      <w:r>
+        <w:rPr>
+          <w:rFonts w:ascii="Times New Roman" w:eastAsia="Times New Roman" w:hAnsi="Times New Roman" w:cs="Times New Roman"/>
           <w:sz w:val="24"/>
           <w:szCs w:val="24"/>
         </w:rPr>
@@ -768,18 +702,18 @@
     <w:p>
       <w:pPr>
         <w:keepNext/>
-        <w:spacing w:before="120" w:after="60" w:line="240" w:lineRule="auto"/>
-        <w:rPr>
-          <w:rFonts w:ascii="Arial" w:hAnsi="Arial" w:cs="Arial"/>
-          <w:b/>
-          <w:bCs/>
-          <w:sz w:val="24"/>
-          <w:szCs w:val="24"/>
-        </w:rPr>
-      </w:pPr>
-      <w:r>
-        <w:rPr>
-          <w:rFonts w:ascii="Arial" w:hAnsi="Arial" w:cs="Arial"/>
+        <w:spacing w:before="120" w:after="60" w:line="276" w:lineRule="auto"/>
+        <w:rPr>
+          <w:rFonts w:ascii="Times New Roman" w:eastAsia="Times New Roman" w:hAnsi="Times New Roman" w:cs="Times New Roman"/>
+          <w:b/>
+          <w:bCs/>
+          <w:sz w:val="24"/>
+          <w:szCs w:val="24"/>
+        </w:rPr>
+      </w:pPr>
+      <w:r>
+        <w:rPr>
+          <w:rFonts w:ascii="Times New Roman" w:eastAsia="Times New Roman" w:hAnsi="Times New Roman" w:cs="Times New Roman"/>
           <w:b/>
           <w:bCs/>
           <w:sz w:val="24"/>
@@ -790,16 +724,16 @@
     </w:p>
     <w:p>
       <w:pPr>
-        <w:spacing w:before="0" w:after="0" w:line="240" w:lineRule="auto"/>
-        <w:rPr>
-          <w:rFonts w:ascii="Arial" w:hAnsi="Arial" w:cs="Arial"/>
-          <w:sz w:val="24"/>
-          <w:szCs w:val="24"/>
-        </w:rPr>
-      </w:pPr>
-      <w:r>
-        <w:rPr>
-          <w:rFonts w:ascii="Arial" w:hAnsi="Arial" w:cs="Arial"/>
+        <w:spacing w:before="0" w:after="0" w:line="276" w:lineRule="auto"/>
+        <w:rPr>
+          <w:rFonts w:ascii="Times New Roman" w:eastAsia="Times New Roman" w:hAnsi="Times New Roman" w:cs="Times New Roman"/>
+          <w:sz w:val="24"/>
+          <w:szCs w:val="24"/>
+        </w:rPr>
+      </w:pPr>
+      <w:r>
+        <w:rPr>
+          <w:rFonts w:ascii="Times New Roman" w:eastAsia="Times New Roman" w:hAnsi="Times New Roman" w:cs="Times New Roman"/>
           <w:sz w:val="24"/>
           <w:szCs w:val="24"/>
         </w:rPr>
@@ -811,14 +745,14 @@
         <w:spacing w:before="0" w:after="120" w:line="360" w:lineRule="auto"/>
         <w:jc w:val="both"/>
         <w:rPr>
-          <w:rFonts w:ascii="Arial" w:hAnsi="Arial" w:cs="Arial"/>
-          <w:sz w:val="24"/>
-          <w:szCs w:val="24"/>
-        </w:rPr>
-      </w:pPr>
-      <w:r>
-        <w:rPr>
-          <w:rFonts w:ascii="Arial" w:hAnsi="Arial" w:cs="Arial"/>
+          <w:rFonts w:ascii="Times New Roman" w:eastAsia="Times New Roman" w:hAnsi="Times New Roman" w:cs="Times New Roman"/>
+          <w:sz w:val="24"/>
+          <w:szCs w:val="24"/>
+        </w:rPr>
+      </w:pPr>
+      <w:r>
+        <w:rPr>
+          <w:rFonts w:ascii="Times New Roman" w:eastAsia="Times New Roman" w:hAnsi="Times New Roman" w:cs="Times New Roman"/>
           <w:sz w:val="24"/>
           <w:szCs w:val="24"/>
         </w:rPr>
@@ -827,16 +761,16 @@
     </w:p>
     <w:p>
       <w:pPr>
-        <w:spacing w:before="0" w:after="0" w:line="240" w:lineRule="auto"/>
-        <w:rPr>
-          <w:rFonts w:ascii="Arial" w:hAnsi="Arial" w:cs="Arial"/>
-          <w:sz w:val="24"/>
-          <w:szCs w:val="24"/>
-        </w:rPr>
-      </w:pPr>
-      <w:r>
-        <w:rPr>
-          <w:rFonts w:ascii="Arial" w:hAnsi="Arial" w:cs="Arial"/>
+        <w:spacing w:before="0" w:after="0" w:line="276" w:lineRule="auto"/>
+        <w:rPr>
+          <w:rFonts w:ascii="Times New Roman" w:eastAsia="Times New Roman" w:hAnsi="Times New Roman" w:cs="Times New Roman"/>
+          <w:sz w:val="24"/>
+          <w:szCs w:val="24"/>
+        </w:rPr>
+      </w:pPr>
+      <w:r>
+        <w:rPr>
+          <w:rFonts w:ascii="Times New Roman" w:eastAsia="Times New Roman" w:hAnsi="Times New Roman" w:cs="Times New Roman"/>
           <w:sz w:val="24"/>
           <w:szCs w:val="24"/>
         </w:rPr>
@@ -845,16 +779,16 @@
     </w:p>
     <w:p>
       <w:pPr>
-        <w:spacing w:before="0" w:after="0" w:line="240" w:lineRule="auto"/>
-        <w:rPr>
-          <w:rFonts w:ascii="Arial" w:hAnsi="Arial" w:cs="Arial"/>
-          <w:sz w:val="24"/>
-          <w:szCs w:val="24"/>
-        </w:rPr>
-      </w:pPr>
-      <w:r>
-        <w:rPr>
-          <w:rFonts w:ascii="Arial" w:hAnsi="Arial" w:cs="Arial"/>
+        <w:spacing w:before="0" w:after="0" w:line="276" w:lineRule="auto"/>
+        <w:rPr>
+          <w:rFonts w:ascii="Times New Roman" w:eastAsia="Times New Roman" w:hAnsi="Times New Roman" w:cs="Times New Roman"/>
+          <w:sz w:val="24"/>
+          <w:szCs w:val="24"/>
+        </w:rPr>
+      </w:pPr>
+      <w:r>
+        <w:rPr>
+          <w:rFonts w:ascii="Times New Roman" w:eastAsia="Times New Roman" w:hAnsi="Times New Roman" w:cs="Times New Roman"/>
           <w:sz w:val="24"/>
           <w:szCs w:val="24"/>
         </w:rPr>
@@ -863,26 +797,26 @@
     </w:p>
     <w:p>
       <w:pPr>
-        <w:spacing w:before="0" w:after="120" w:line="240" w:lineRule="auto"/>
-        <w:rPr>
-          <w:rFonts w:ascii="Arial" w:hAnsi="Arial" w:cs="Arial"/>
-          <w:sz w:val="24"/>
-          <w:szCs w:val="24"/>
-        </w:rPr>
-      </w:pPr>
-    </w:p>
-    <w:p>
-      <w:pPr>
-        <w:spacing w:before="0" w:after="0" w:line="240" w:lineRule="auto"/>
-        <w:rPr>
-          <w:rFonts w:ascii="Arial" w:hAnsi="Arial" w:cs="Arial"/>
-          <w:sz w:val="24"/>
-          <w:szCs w:val="24"/>
-        </w:rPr>
-      </w:pPr>
-      <w:r>
-        <w:rPr>
-          <w:rFonts w:ascii="Arial" w:hAnsi="Arial" w:cs="Arial"/>
+        <w:spacing w:before="0" w:after="120" w:line="276" w:lineRule="auto"/>
+        <w:rPr>
+          <w:rFonts w:ascii="Times New Roman" w:eastAsia="Times New Roman" w:hAnsi="Times New Roman" w:cs="Times New Roman"/>
+          <w:sz w:val="24"/>
+          <w:szCs w:val="24"/>
+        </w:rPr>
+      </w:pPr>
+    </w:p>
+    <w:p>
+      <w:pPr>
+        <w:spacing w:before="0" w:after="0" w:line="276" w:lineRule="auto"/>
+        <w:rPr>
+          <w:rFonts w:ascii="Times New Roman" w:eastAsia="Times New Roman" w:hAnsi="Times New Roman" w:cs="Times New Roman"/>
+          <w:sz w:val="24"/>
+          <w:szCs w:val="24"/>
+        </w:rPr>
+      </w:pPr>
+      <w:r>
+        <w:rPr>
+          <w:rFonts w:ascii="Times New Roman" w:eastAsia="Times New Roman" w:hAnsi="Times New Roman" w:cs="Times New Roman"/>
           <w:sz w:val="24"/>
           <w:szCs w:val="24"/>
         </w:rPr>
@@ -892,18 +826,18 @@
     <w:p>
       <w:pPr>
         <w:keepNext/>
-        <w:spacing w:before="240" w:after="120" w:line="240" w:lineRule="auto"/>
-        <w:rPr>
-          <w:rFonts w:ascii="Arial" w:hAnsi="Arial" w:cs="Arial"/>
-          <w:b/>
-          <w:bCs/>
-          <w:sz w:val="24"/>
-          <w:szCs w:val="24"/>
-        </w:rPr>
-      </w:pPr>
-      <w:r>
-        <w:rPr>
-          <w:rFonts w:ascii="Arial" w:hAnsi="Arial" w:cs="Arial"/>
+        <w:spacing w:before="240" w:after="120" w:line="276" w:lineRule="auto"/>
+        <w:rPr>
+          <w:rFonts w:ascii="Times New Roman" w:eastAsia="Times New Roman" w:hAnsi="Times New Roman" w:cs="Times New Roman"/>
+          <w:b/>
+          <w:bCs/>
+          <w:sz w:val="24"/>
+          <w:szCs w:val="24"/>
+        </w:rPr>
+      </w:pPr>
+      <w:r>
+        <w:rPr>
+          <w:rFonts w:ascii="Times New Roman" w:eastAsia="Times New Roman" w:hAnsi="Times New Roman" w:cs="Times New Roman"/>
           <w:b/>
           <w:bCs/>
           <w:sz w:val="24"/>
@@ -914,16 +848,16 @@
     </w:p>
     <w:p>
       <w:pPr>
-        <w:spacing w:before="0" w:after="0" w:line="240" w:lineRule="auto"/>
-        <w:rPr>
-          <w:rFonts w:ascii="Arial" w:hAnsi="Arial" w:cs="Arial"/>
-          <w:sz w:val="24"/>
-          <w:szCs w:val="24"/>
-        </w:rPr>
-      </w:pPr>
-      <w:r>
-        <w:rPr>
-          <w:rFonts w:ascii="Arial" w:hAnsi="Arial" w:cs="Arial"/>
+        <w:spacing w:before="0" w:after="0" w:line="276" w:lineRule="auto"/>
+        <w:rPr>
+          <w:rFonts w:ascii="Times New Roman" w:eastAsia="Times New Roman" w:hAnsi="Times New Roman" w:cs="Times New Roman"/>
+          <w:sz w:val="24"/>
+          <w:szCs w:val="24"/>
+        </w:rPr>
+      </w:pPr>
+      <w:r>
+        <w:rPr>
+          <w:rFonts w:ascii="Times New Roman" w:eastAsia="Times New Roman" w:hAnsi="Times New Roman" w:cs="Times New Roman"/>
           <w:sz w:val="24"/>
           <w:szCs w:val="24"/>
         </w:rPr>
@@ -935,14 +869,14 @@
         <w:spacing w:before="0" w:after="120" w:line="360" w:lineRule="auto"/>
         <w:jc w:val="both"/>
         <w:rPr>
-          <w:rFonts w:ascii="Arial" w:hAnsi="Arial" w:cs="Arial"/>
-          <w:sz w:val="24"/>
-          <w:szCs w:val="24"/>
-        </w:rPr>
-      </w:pPr>
-      <w:r>
-        <w:rPr>
-          <w:rFonts w:ascii="Arial" w:hAnsi="Arial" w:cs="Arial"/>
+          <w:rFonts w:ascii="Times New Roman" w:eastAsia="Times New Roman" w:hAnsi="Times New Roman" w:cs="Times New Roman"/>
+          <w:sz w:val="24"/>
+          <w:szCs w:val="24"/>
+        </w:rPr>
+      </w:pPr>
+      <w:r>
+        <w:rPr>
+          <w:rFonts w:ascii="Times New Roman" w:eastAsia="Times New Roman" w:hAnsi="Times New Roman" w:cs="Times New Roman"/>
           <w:sz w:val="24"/>
           <w:szCs w:val="24"/>
         </w:rPr>
@@ -951,16 +885,16 @@
     </w:p>
     <w:p>
       <w:pPr>
-        <w:spacing w:before="0" w:after="0" w:line="240" w:lineRule="auto"/>
-        <w:rPr>
-          <w:rFonts w:ascii="Arial" w:hAnsi="Arial" w:cs="Arial"/>
-          <w:sz w:val="24"/>
-          <w:szCs w:val="24"/>
-        </w:rPr>
-      </w:pPr>
-      <w:r>
-        <w:rPr>
-          <w:rFonts w:ascii="Arial" w:hAnsi="Arial" w:cs="Arial"/>
+        <w:spacing w:before="0" w:after="0" w:line="276" w:lineRule="auto"/>
+        <w:rPr>
+          <w:rFonts w:ascii="Times New Roman" w:eastAsia="Times New Roman" w:hAnsi="Times New Roman" w:cs="Times New Roman"/>
+          <w:sz w:val="24"/>
+          <w:szCs w:val="24"/>
+        </w:rPr>
+      </w:pPr>
+      <w:r>
+        <w:rPr>
+          <w:rFonts w:ascii="Times New Roman" w:eastAsia="Times New Roman" w:hAnsi="Times New Roman" w:cs="Times New Roman"/>
           <w:sz w:val="24"/>
           <w:szCs w:val="24"/>
         </w:rPr>
@@ -970,18 +904,18 @@
     <w:p>
       <w:pPr>
         <w:keepNext/>
-        <w:spacing w:before="240" w:after="120" w:line="240" w:lineRule="auto"/>
-        <w:rPr>
-          <w:rFonts w:ascii="Arial" w:hAnsi="Arial" w:cs="Arial"/>
-          <w:b/>
-          <w:bCs/>
-          <w:sz w:val="24"/>
-          <w:szCs w:val="24"/>
-        </w:rPr>
-      </w:pPr>
-      <w:r>
-        <w:rPr>
-          <w:rFonts w:ascii="Arial" w:hAnsi="Arial" w:cs="Arial"/>
+        <w:spacing w:before="240" w:after="120" w:line="276" w:lineRule="auto"/>
+        <w:rPr>
+          <w:rFonts w:ascii="Times New Roman" w:eastAsia="Times New Roman" w:hAnsi="Times New Roman" w:cs="Times New Roman"/>
+          <w:b/>
+          <w:bCs/>
+          <w:sz w:val="24"/>
+          <w:szCs w:val="24"/>
+        </w:rPr>
+      </w:pPr>
+      <w:r>
+        <w:rPr>
+          <w:rFonts w:ascii="Times New Roman" w:eastAsia="Times New Roman" w:hAnsi="Times New Roman" w:cs="Times New Roman"/>
           <w:b/>
           <w:bCs/>
           <w:sz w:val="24"/>
@@ -992,16 +926,16 @@
     </w:p>
     <w:p>
       <w:pPr>
-        <w:spacing w:before="0" w:after="0" w:line="240" w:lineRule="auto"/>
-        <w:rPr>
-          <w:rFonts w:ascii="Arial" w:hAnsi="Arial" w:cs="Arial"/>
-          <w:sz w:val="24"/>
-          <w:szCs w:val="24"/>
-        </w:rPr>
-      </w:pPr>
-      <w:r>
-        <w:rPr>
-          <w:rFonts w:ascii="Arial" w:hAnsi="Arial" w:cs="Arial"/>
+        <w:spacing w:before="0" w:after="0" w:line="276" w:lineRule="auto"/>
+        <w:rPr>
+          <w:rFonts w:ascii="Times New Roman" w:eastAsia="Times New Roman" w:hAnsi="Times New Roman" w:cs="Times New Roman"/>
+          <w:sz w:val="24"/>
+          <w:szCs w:val="24"/>
+        </w:rPr>
+      </w:pPr>
+      <w:r>
+        <w:rPr>
+          <w:rFonts w:ascii="Times New Roman" w:eastAsia="Times New Roman" w:hAnsi="Times New Roman" w:cs="Times New Roman"/>
           <w:sz w:val="24"/>
           <w:szCs w:val="24"/>
         </w:rPr>
@@ -1013,14 +947,14 @@
         <w:spacing w:before="0" w:after="120" w:line="360" w:lineRule="auto"/>
         <w:jc w:val="both"/>
         <w:rPr>
-          <w:rFonts w:ascii="Arial" w:hAnsi="Arial" w:cs="Arial"/>
-          <w:sz w:val="24"/>
-          <w:szCs w:val="24"/>
-        </w:rPr>
-      </w:pPr>
-      <w:r>
-        <w:rPr>
-          <w:rFonts w:ascii="Arial" w:hAnsi="Arial" w:cs="Arial"/>
+          <w:rFonts w:ascii="Times New Roman" w:eastAsia="Times New Roman" w:hAnsi="Times New Roman" w:cs="Times New Roman"/>
+          <w:sz w:val="24"/>
+          <w:szCs w:val="24"/>
+        </w:rPr>
+      </w:pPr>
+      <w:r>
+        <w:rPr>
+          <w:rFonts w:ascii="Times New Roman" w:eastAsia="Times New Roman" w:hAnsi="Times New Roman" w:cs="Times New Roman"/>
           <w:sz w:val="24"/>
           <w:szCs w:val="24"/>
         </w:rPr>
@@ -1029,16 +963,16 @@
     </w:p>
     <w:p>
       <w:pPr>
-        <w:spacing w:before="0" w:after="0" w:line="240" w:lineRule="auto"/>
-        <w:rPr>
-          <w:rFonts w:ascii="Arial" w:hAnsi="Arial" w:cs="Arial"/>
-          <w:sz w:val="24"/>
-          <w:szCs w:val="24"/>
-        </w:rPr>
-      </w:pPr>
-      <w:r>
-        <w:rPr>
-          <w:rFonts w:ascii="Arial" w:hAnsi="Arial" w:cs="Arial"/>
+        <w:spacing w:before="0" w:after="0" w:line="276" w:lineRule="auto"/>
+        <w:rPr>
+          <w:rFonts w:ascii="Times New Roman" w:eastAsia="Times New Roman" w:hAnsi="Times New Roman" w:cs="Times New Roman"/>
+          <w:sz w:val="24"/>
+          <w:szCs w:val="24"/>
+        </w:rPr>
+      </w:pPr>
+      <w:r>
+        <w:rPr>
+          <w:rFonts w:ascii="Times New Roman" w:eastAsia="Times New Roman" w:hAnsi="Times New Roman" w:cs="Times New Roman"/>
           <w:sz w:val="24"/>
           <w:szCs w:val="24"/>
         </w:rPr>
@@ -1047,27 +981,27 @@
     </w:p>
     <w:p>
       <w:pPr>
-        <w:spacing w:before="0" w:after="0" w:line="240" w:lineRule="auto"/>
-        <w:rPr>
-          <w:rFonts w:ascii="Arial" w:hAnsi="Arial" w:cs="Arial"/>
-          <w:sz w:val="24"/>
-          <w:szCs w:val="24"/>
-        </w:rPr>
-      </w:pPr>
-    </w:p>
-    <w:p>
-      <w:pPr>
-        <w:spacing w:before="0" w:after="0" w:line="240" w:lineRule="auto"/>
+        <w:spacing w:before="0" w:after="0" w:line="276" w:lineRule="auto"/>
+        <w:rPr>
+          <w:rFonts w:ascii="Times New Roman" w:eastAsia="Times New Roman" w:hAnsi="Times New Roman" w:cs="Times New Roman"/>
+          <w:sz w:val="24"/>
+          <w:szCs w:val="24"/>
+        </w:rPr>
+      </w:pPr>
+    </w:p>
+    <w:p>
+      <w:pPr>
+        <w:spacing w:before="0" w:after="0" w:line="276" w:lineRule="auto"/>
         <w:jc w:val="right"/>
         <w:rPr>
-          <w:rFonts w:ascii="Arial" w:hAnsi="Arial" w:cs="Arial"/>
-          <w:sz w:val="24"/>
-          <w:szCs w:val="24"/>
-        </w:rPr>
-      </w:pPr>
-      <w:r>
-        <w:rPr>
-          <w:rFonts w:ascii="Arial" w:hAnsi="Arial" w:cs="Arial"/>
+          <w:rFonts w:ascii="Times New Roman" w:eastAsia="Times New Roman" w:hAnsi="Times New Roman" w:cs="Times New Roman"/>
+          <w:sz w:val="24"/>
+          <w:szCs w:val="24"/>
+        </w:rPr>
+      </w:pPr>
+      <w:r>
+        <w:rPr>
+          <w:rFonts w:ascii="Times New Roman" w:eastAsia="Times New Roman" w:hAnsi="Times New Roman" w:cs="Times New Roman"/>
           <w:sz w:val="24"/>
           <w:szCs w:val="24"/>
         </w:rPr>
@@ -1076,37 +1010,38 @@
     </w:p>
     <w:p>
       <w:pPr>
-        <w:spacing w:before="0" w:after="0" w:line="240" w:lineRule="auto"/>
-        <w:rPr>
-          <w:rFonts w:ascii="Arial" w:hAnsi="Arial" w:cs="Arial"/>
-          <w:sz w:val="24"/>
-          <w:szCs w:val="24"/>
-        </w:rPr>
-      </w:pPr>
-    </w:p>
-    <w:p>
-      <w:pPr>
-        <w:spacing w:before="0" w:after="0" w:line="240" w:lineRule="auto"/>
-        <w:rPr>
-          <w:rFonts w:ascii="Arial" w:hAnsi="Arial" w:cs="Arial"/>
-          <w:sz w:val="24"/>
-          <w:szCs w:val="24"/>
-        </w:rPr>
-      </w:pPr>
-    </w:p>
-    <w:p>
-      <w:pPr>
-        <w:spacing w:before="0" w:after="0" w:line="240" w:lineRule="auto"/>
+        <w:spacing w:before="0" w:after="0" w:line="276" w:lineRule="auto"/>
+        <w:rPr>
+          <w:rFonts w:ascii="Times New Roman" w:eastAsia="Times New Roman" w:hAnsi="Times New Roman" w:cs="Times New Roman"/>
+          <w:sz w:val="24"/>
+          <w:szCs w:val="24"/>
+        </w:rPr>
+      </w:pPr>
+    </w:p>
+    <w:p>
+      <w:pPr>
+        <w:spacing w:before="0" w:after="0" w:line="276" w:lineRule="auto"/>
+        <w:rPr>
+          <w:rFonts w:ascii="Times New Roman" w:eastAsia="Times New Roman" w:hAnsi="Times New Roman" w:cs="Times New Roman"/>
+          <w:sz w:val="24"/>
+          <w:szCs w:val="24"/>
+        </w:rPr>
+      </w:pPr>
+    </w:p>
+    <w:p>
+      <w:pPr>
+        <w:keepNext/>
+        <w:spacing w:before="0" w:after="0" w:line="276" w:lineRule="auto"/>
         <w:jc w:val="center"/>
         <w:rPr>
-          <w:rFonts w:ascii="Arial" w:hAnsi="Arial" w:cs="Arial"/>
-          <w:sz w:val="24"/>
-          <w:szCs w:val="24"/>
-        </w:rPr>
-      </w:pPr>
-      <w:r>
-        <w:rPr>
-          <w:rFonts w:ascii="Arial" w:hAnsi="Arial" w:cs="Arial"/>
+          <w:rFonts w:ascii="Times New Roman" w:eastAsia="Times New Roman" w:hAnsi="Times New Roman" w:cs="Times New Roman"/>
+          <w:sz w:val="24"/>
+          <w:szCs w:val="24"/>
+        </w:rPr>
+      </w:pPr>
+      <w:r>
+        <w:rPr>
+          <w:rFonts w:ascii="Times New Roman" w:eastAsia="Times New Roman" w:hAnsi="Times New Roman" w:cs="Times New Roman"/>
           <w:sz w:val="24"/>
           <w:szCs w:val="24"/>
         </w:rPr>
@@ -1115,17 +1050,18 @@
     </w:p>
     <w:p>
       <w:pPr>
-        <w:spacing w:before="0" w:after="0" w:line="240" w:lineRule="auto"/>
+        <w:keepNext/>
+        <w:spacing w:before="0" w:after="0" w:line="276" w:lineRule="auto"/>
         <w:jc w:val="center"/>
         <w:rPr>
-          <w:rFonts w:ascii="Arial" w:hAnsi="Arial" w:cs="Arial"/>
-          <w:sz w:val="24"/>
-          <w:szCs w:val="24"/>
-        </w:rPr>
-      </w:pPr>
-      <w:r>
-        <w:rPr>
-          <w:rFonts w:ascii="Arial" w:hAnsi="Arial" w:cs="Arial"/>
+          <w:rFonts w:ascii="Times New Roman" w:eastAsia="Times New Roman" w:hAnsi="Times New Roman" w:cs="Times New Roman"/>
+          <w:sz w:val="24"/>
+          <w:szCs w:val="24"/>
+        </w:rPr>
+      </w:pPr>
+      <w:r>
+        <w:rPr>
+          <w:rFonts w:ascii="Times New Roman" w:eastAsia="Times New Roman" w:hAnsi="Times New Roman" w:cs="Times New Roman"/>
           <w:sz w:val="24"/>
           <w:szCs w:val="24"/>
         </w:rPr>
@@ -1134,36 +1070,37 @@
     </w:p>
     <w:p>
       <w:pPr>
-        <w:spacing w:before="0" w:after="0" w:line="240" w:lineRule="auto"/>
+        <w:keepNext/>
+        <w:spacing w:before="0" w:after="0" w:line="276" w:lineRule="auto"/>
         <w:jc w:val="center"/>
         <w:rPr>
-          <w:rFonts w:ascii="Arial" w:hAnsi="Arial" w:cs="Arial"/>
-          <w:sz w:val="24"/>
-          <w:szCs w:val="24"/>
-        </w:rPr>
-      </w:pPr>
-      <w:r>
-        <w:rPr>
-          <w:rFonts w:ascii="Arial" w:hAnsi="Arial" w:cs="Arial"/>
-          <w:sz w:val="24"/>
-          <w:szCs w:val="24"/>
-        </w:rPr>
-        <w:t xml:space="preserve">{assinaturaCargo}</w:t>
-      </w:r>
-    </w:p>
-    <w:p>
-      <w:pPr>
-        <w:spacing w:before="0" w:after="0" w:line="240" w:lineRule="auto"/>
+          <w:rFonts w:ascii="Times New Roman" w:eastAsia="Times New Roman" w:hAnsi="Times New Roman" w:cs="Times New Roman"/>
+          <w:sz w:val="24"/>
+          <w:szCs w:val="24"/>
+        </w:rPr>
+      </w:pPr>
+      <w:r>
+        <w:rPr>
+          <w:rFonts w:ascii="Times New Roman" w:eastAsia="Times New Roman" w:hAnsi="Times New Roman" w:cs="Times New Roman"/>
+          <w:sz w:val="24"/>
+          <w:szCs w:val="24"/>
+        </w:rPr>
+        <w:t xml:space="preserve">Assistente Social</w:t>
+      </w:r>
+    </w:p>
+    <w:p>
+      <w:pPr>
+        <w:spacing w:before="0" w:after="0" w:line="276" w:lineRule="auto"/>
         <w:jc w:val="center"/>
         <w:rPr>
-          <w:rFonts w:ascii="Arial" w:hAnsi="Arial" w:cs="Arial"/>
-          <w:sz w:val="24"/>
-          <w:szCs w:val="24"/>
-        </w:rPr>
-      </w:pPr>
-      <w:r>
-        <w:rPr>
-          <w:rFonts w:ascii="Arial" w:hAnsi="Arial" w:cs="Arial"/>
+          <w:rFonts w:ascii="Times New Roman" w:eastAsia="Times New Roman" w:hAnsi="Times New Roman" w:cs="Times New Roman"/>
+          <w:sz w:val="24"/>
+          <w:szCs w:val="24"/>
+        </w:rPr>
+      </w:pPr>
+      <w:r>
+        <w:rPr>
+          <w:rFonts w:ascii="Times New Roman" w:eastAsia="Times New Roman" w:hAnsi="Times New Roman" w:cs="Times New Roman"/>
           <w:sz w:val="24"/>
           <w:szCs w:val="24"/>
         </w:rPr>
@@ -1243,7 +1180,7 @@
         <w:lang w:eastAsia="pt-BR"/>
       </w:rPr>
       <w:drawing>
-        <wp:anchor distT="0" distB="0" distL="114300" distR="114300" simplePos="0" relativeHeight="251658240" behindDoc="1" locked="0" layoutInCell="1" allowOverlap="1" wp14:anchorId="5B831126" wp14:editId="4E35CDC6">
+        <wp:anchor distT="0" distB="0" distL="114300" distR="114300" simplePos="0" relativeHeight="251658240" behindDoc="1" locked="0" layoutInCell="1" allowOverlap="1">
           <wp:simplePos x="0" y="0"/>
           <wp:positionH relativeFrom="page">
             <wp:posOffset>-15446</wp:posOffset>
@@ -1289,12 +1226,6 @@
               </pic:pic>
             </a:graphicData>
           </a:graphic>
-          <wp14:sizeRelH relativeFrom="page">
-            <wp14:pctWidth>0</wp14:pctWidth>
-          </wp14:sizeRelH>
-          <wp14:sizeRelV relativeFrom="page">
-            <wp14:pctHeight>0</wp14:pctHeight>
-          </wp14:sizeRelV>
         </wp:anchor>
       </w:drawing>
     </w:r>
@@ -1768,6 +1699,17 @@
     <w:uiPriority w:val="99"/>
     <w:rsid w:val="00C312B1"/>
   </w:style>
+  <w:style w:type="character" w:styleId="Forte">
+    <w:name w:val="Strong"/>
+    <w:basedOn w:val="Fontepargpadro"/>
+    <w:uiPriority w:val="22"/>
+    <w:qFormat/>
+    <w:rsid w:val="00057DDD"/>
+    <w:rPr>
+      <w:b/>
+      <w:bCs/>
+    </w:rPr>
+  </w:style>
 </w:styles>
 </file>
 
@@ -1814,7 +1756,7 @@
     </a:clrScheme>
     <a:fontScheme name="Office">
       <a:majorFont>
-        <a:latin typeface="Calibri Light" panose="020F0302020204030204"/>
+        <a:latin typeface="Calibri Light"/>
         <a:ea typeface=""/>
         <a:cs typeface=""/>
         <a:font script="Jpan" typeface="游ゴシック Light"/>
@@ -1849,7 +1791,7 @@
         <a:font script="Geor" typeface="Sylfaen"/>
       </a:majorFont>
       <a:minorFont>
-        <a:latin typeface="Calibri" panose="020F0502020204030204"/>
+        <a:latin typeface="Calibri"/>
         <a:ea typeface=""/>
         <a:cs typeface=""/>
         <a:font script="Jpan" typeface="游明朝"/>

</xml_diff>